<commit_message>
Se mejoro estilado de carrito y jsx
</commit_message>
<xml_diff>
--- a/Qué es React JS.docx
+++ b/Qué es React JS.docx
@@ -4458,6 +4458,2615 @@
       <w:proofErr w:type="gramEnd"/>
       <w:r>
         <w:t>;</w:t>
+      </w:r>
+    </w:p>
+    <w:p/>
+    <w:p>
+      <w:pPr>
+        <w:rPr>
+          <w:lang w:val="es-AR"/>
+        </w:rPr>
+      </w:pPr>
+      <w:r>
+        <w:rPr>
+          <w:lang w:val="es-AR"/>
+        </w:rPr>
+        <w:t xml:space="preserve">Este botón recibe un texto y una función de clic a través de </w:t>
+      </w:r>
+      <w:proofErr w:type="spellStart"/>
+      <w:r>
+        <w:rPr>
+          <w:lang w:val="es-AR"/>
+        </w:rPr>
+        <w:t>props</w:t>
+      </w:r>
+      <w:proofErr w:type="spellEnd"/>
+      <w:r>
+        <w:rPr>
+          <w:lang w:val="es-AR"/>
+        </w:rPr>
+        <w:t>, sin gestionar datos propios.</w:t>
+      </w:r>
+    </w:p>
+    <w:p>
+      <w:pPr>
+        <w:rPr>
+          <w:b/>
+          <w:bCs/>
+          <w:lang w:val="es-AR"/>
+        </w:rPr>
+      </w:pPr>
+      <w:r>
+        <w:rPr>
+          <w:b/>
+          <w:bCs/>
+          <w:lang w:val="es-AR"/>
+        </w:rPr>
+        <w:t>Componentes contenedores</w:t>
+      </w:r>
+    </w:p>
+    <w:p>
+      <w:pPr>
+        <w:rPr>
+          <w:lang w:val="es-AR"/>
+        </w:rPr>
+      </w:pPr>
+      <w:r>
+        <w:rPr>
+          <w:lang w:val="es-AR"/>
+        </w:rPr>
+        <w:t>Los componentes contenedores, también llamados </w:t>
+      </w:r>
+      <w:proofErr w:type="spellStart"/>
+      <w:r>
+        <w:rPr>
+          <w:b/>
+          <w:bCs/>
+          <w:lang w:val="es-AR"/>
+        </w:rPr>
+        <w:t>Stateful</w:t>
+      </w:r>
+      <w:proofErr w:type="spellEnd"/>
+      <w:r>
+        <w:rPr>
+          <w:b/>
+          <w:bCs/>
+          <w:lang w:val="es-AR"/>
+        </w:rPr>
+        <w:t xml:space="preserve"> </w:t>
+      </w:r>
+      <w:proofErr w:type="spellStart"/>
+      <w:r>
+        <w:rPr>
+          <w:b/>
+          <w:bCs/>
+          <w:lang w:val="es-AR"/>
+        </w:rPr>
+        <w:t>Components</w:t>
+      </w:r>
+      <w:proofErr w:type="spellEnd"/>
+      <w:r>
+        <w:rPr>
+          <w:lang w:val="es-AR"/>
+        </w:rPr>
+        <w:t>, se encargan de gestionar el estado de la aplicación y la lógica de negocio. Estos componentes encapsulan a otros componentes y les proveen de las propiedades que necesitan para funcionar.</w:t>
+      </w:r>
+    </w:p>
+    <w:p>
+      <w:pPr>
+        <w:rPr>
+          <w:lang w:val="es-AR"/>
+        </w:rPr>
+      </w:pPr>
+      <w:r>
+        <w:rPr>
+          <w:b/>
+          <w:bCs/>
+          <w:lang w:val="es-AR"/>
+        </w:rPr>
+        <w:t>Características de los componentes contenedores:</w:t>
+      </w:r>
+    </w:p>
+    <w:p>
+      <w:pPr>
+        <w:numPr>
+          <w:ilvl w:val="0"/>
+          <w:numId w:val="6"/>
+        </w:numPr>
+        <w:rPr>
+          <w:lang w:val="es-AR"/>
+        </w:rPr>
+      </w:pPr>
+      <w:r>
+        <w:rPr>
+          <w:b/>
+          <w:bCs/>
+          <w:lang w:val="es-AR"/>
+        </w:rPr>
+        <w:t>Gestión de Datos:</w:t>
+      </w:r>
+      <w:r>
+        <w:rPr>
+          <w:lang w:val="es-AR"/>
+        </w:rPr>
+        <w:t xml:space="preserve"> Interactúan con </w:t>
+      </w:r>
+      <w:proofErr w:type="spellStart"/>
+      <w:r>
+        <w:rPr>
+          <w:lang w:val="es-AR"/>
+        </w:rPr>
+        <w:t>APIs</w:t>
+      </w:r>
+      <w:proofErr w:type="spellEnd"/>
+      <w:r>
+        <w:rPr>
+          <w:lang w:val="es-AR"/>
+        </w:rPr>
+        <w:t>, manejan el estado y gestionan los flujos de datos.</w:t>
+      </w:r>
+    </w:p>
+    <w:p>
+      <w:pPr>
+        <w:numPr>
+          <w:ilvl w:val="0"/>
+          <w:numId w:val="6"/>
+        </w:numPr>
+        <w:rPr>
+          <w:lang w:val="es-AR"/>
+        </w:rPr>
+      </w:pPr>
+      <w:r>
+        <w:rPr>
+          <w:b/>
+          <w:bCs/>
+          <w:lang w:val="es-AR"/>
+        </w:rPr>
+        <w:t>Encapsulan la Lógica:</w:t>
+      </w:r>
+      <w:r>
+        <w:rPr>
+          <w:lang w:val="es-AR"/>
+        </w:rPr>
+        <w:t> Contienen la lógica que define cómo se comporta la aplicación y transmiten esta lógica a los componentes de presentación.</w:t>
+      </w:r>
+    </w:p>
+    <w:p>
+      <w:pPr>
+        <w:numPr>
+          <w:ilvl w:val="0"/>
+          <w:numId w:val="6"/>
+        </w:numPr>
+        <w:rPr>
+          <w:lang w:val="es-AR"/>
+        </w:rPr>
+      </w:pPr>
+      <w:r>
+        <w:rPr>
+          <w:b/>
+          <w:bCs/>
+          <w:lang w:val="es-AR"/>
+        </w:rPr>
+        <w:t>Comunicación entre Componentes:</w:t>
+      </w:r>
+      <w:r>
+        <w:rPr>
+          <w:lang w:val="es-AR"/>
+        </w:rPr>
+        <w:t> Gestionan cómo los componentes hijos interactúan entre sí y con la fuente de datos.</w:t>
+      </w:r>
+    </w:p>
+    <w:p>
+      <w:pPr>
+        <w:rPr>
+          <w:lang w:val="es-AR"/>
+        </w:rPr>
+      </w:pPr>
+      <w:r>
+        <w:rPr>
+          <w:b/>
+          <w:bCs/>
+          <w:lang w:val="es-AR"/>
+        </w:rPr>
+        <w:t>Ejemplo de un componente contenedor:</w:t>
+      </w:r>
+    </w:p>
+    <w:p>
+      <w:proofErr w:type="spellStart"/>
+      <w:r>
+        <w:t>import</w:t>
+      </w:r>
+      <w:proofErr w:type="spellEnd"/>
+      <w:r>
+        <w:t xml:space="preserve"> </w:t>
+      </w:r>
+      <w:proofErr w:type="gramStart"/>
+      <w:r>
+        <w:t xml:space="preserve">{ </w:t>
+      </w:r>
+      <w:proofErr w:type="spellStart"/>
+      <w:r>
+        <w:t>useState</w:t>
+      </w:r>
+      <w:proofErr w:type="spellEnd"/>
+      <w:proofErr w:type="gramEnd"/>
+      <w:r>
+        <w:t xml:space="preserve"> } </w:t>
+      </w:r>
+      <w:proofErr w:type="spellStart"/>
+      <w:r>
+        <w:t>from</w:t>
+      </w:r>
+      <w:proofErr w:type="spellEnd"/>
+      <w:r>
+        <w:t xml:space="preserve"> '</w:t>
+      </w:r>
+      <w:proofErr w:type="spellStart"/>
+      <w:r>
+        <w:t>react</w:t>
+      </w:r>
+      <w:proofErr w:type="spellEnd"/>
+      <w:r>
+        <w:t>';</w:t>
+      </w:r>
+    </w:p>
+    <w:p>
+      <w:proofErr w:type="spellStart"/>
+      <w:r>
+        <w:t>const</w:t>
+      </w:r>
+      <w:proofErr w:type="spellEnd"/>
+      <w:r>
+        <w:t xml:space="preserve"> </w:t>
+      </w:r>
+      <w:proofErr w:type="spellStart"/>
+      <w:r>
+        <w:t>FormContainer</w:t>
+      </w:r>
+      <w:proofErr w:type="spellEnd"/>
+      <w:r>
+        <w:t xml:space="preserve"> = () =&gt; {</w:t>
+      </w:r>
+    </w:p>
+    <w:p>
+      <w:r>
+        <w:t xml:space="preserve">  </w:t>
+      </w:r>
+      <w:proofErr w:type="spellStart"/>
+      <w:r>
+        <w:t>const</w:t>
+      </w:r>
+      <w:proofErr w:type="spellEnd"/>
+      <w:r>
+        <w:t xml:space="preserve"> [</w:t>
+      </w:r>
+      <w:proofErr w:type="spellStart"/>
+      <w:r>
+        <w:t>inputValue</w:t>
+      </w:r>
+      <w:proofErr w:type="spellEnd"/>
+      <w:r>
+        <w:t xml:space="preserve">, </w:t>
+      </w:r>
+      <w:proofErr w:type="spellStart"/>
+      <w:r>
+        <w:t>setInputValue</w:t>
+      </w:r>
+      <w:proofErr w:type="spellEnd"/>
+      <w:r>
+        <w:t xml:space="preserve">] = </w:t>
+      </w:r>
+      <w:proofErr w:type="spellStart"/>
+      <w:proofErr w:type="gramStart"/>
+      <w:r>
+        <w:t>useState</w:t>
+      </w:r>
+      <w:proofErr w:type="spellEnd"/>
+      <w:r>
+        <w:t>(</w:t>
+      </w:r>
+      <w:proofErr w:type="gramEnd"/>
+      <w:r>
+        <w:t>'');</w:t>
+      </w:r>
+    </w:p>
+    <w:p>
+      <w:r>
+        <w:t xml:space="preserve">  </w:t>
+      </w:r>
+      <w:proofErr w:type="spellStart"/>
+      <w:r>
+        <w:t>const</w:t>
+      </w:r>
+      <w:proofErr w:type="spellEnd"/>
+      <w:r>
+        <w:t xml:space="preserve"> </w:t>
+      </w:r>
+      <w:proofErr w:type="spellStart"/>
+      <w:r>
+        <w:t>handleChange</w:t>
+      </w:r>
+      <w:proofErr w:type="spellEnd"/>
+      <w:r>
+        <w:t xml:space="preserve"> = (</w:t>
+      </w:r>
+      <w:proofErr w:type="spellStart"/>
+      <w:r>
+        <w:t>event</w:t>
+      </w:r>
+      <w:proofErr w:type="spellEnd"/>
+      <w:r>
+        <w:t>) =&gt; {</w:t>
+      </w:r>
+    </w:p>
+    <w:p>
+      <w:r>
+        <w:t xml:space="preserve">    </w:t>
+      </w:r>
+      <w:proofErr w:type="spellStart"/>
+      <w:r>
+        <w:t>setInputValue</w:t>
+      </w:r>
+      <w:proofErr w:type="spellEnd"/>
+      <w:r>
+        <w:t>(</w:t>
+      </w:r>
+      <w:proofErr w:type="spellStart"/>
+      <w:proofErr w:type="gramStart"/>
+      <w:r>
+        <w:t>event.target</w:t>
+      </w:r>
+      <w:proofErr w:type="gramEnd"/>
+      <w:r>
+        <w:t>.value</w:t>
+      </w:r>
+      <w:proofErr w:type="spellEnd"/>
+      <w:r>
+        <w:t>);</w:t>
+      </w:r>
+    </w:p>
+    <w:p>
+      <w:r>
+        <w:t xml:space="preserve">  };</w:t>
+      </w:r>
+    </w:p>
+    <w:p>
+      <w:r>
+        <w:t xml:space="preserve">  </w:t>
+      </w:r>
+      <w:proofErr w:type="spellStart"/>
+      <w:r>
+        <w:t>return</w:t>
+      </w:r>
+      <w:proofErr w:type="spellEnd"/>
+      <w:r>
+        <w:t xml:space="preserve"> &lt;</w:t>
+      </w:r>
+      <w:proofErr w:type="spellStart"/>
+      <w:r>
+        <w:t>InputComponent</w:t>
+      </w:r>
+      <w:proofErr w:type="spellEnd"/>
+      <w:r>
+        <w:t xml:space="preserve"> </w:t>
+      </w:r>
+      <w:proofErr w:type="spellStart"/>
+      <w:r>
+        <w:t>value</w:t>
+      </w:r>
+      <w:proofErr w:type="spellEnd"/>
+      <w:r>
+        <w:t>={</w:t>
+      </w:r>
+      <w:proofErr w:type="spellStart"/>
+      <w:r>
+        <w:t>inputValue</w:t>
+      </w:r>
+      <w:proofErr w:type="spellEnd"/>
+      <w:r>
+        <w:t xml:space="preserve">} </w:t>
+      </w:r>
+      <w:proofErr w:type="spellStart"/>
+      <w:r>
+        <w:t>onChange</w:t>
+      </w:r>
+      <w:proofErr w:type="spellEnd"/>
+      <w:r>
+        <w:t>={</w:t>
+      </w:r>
+      <w:proofErr w:type="spellStart"/>
+      <w:r>
+        <w:t>handleChange</w:t>
+      </w:r>
+      <w:proofErr w:type="spellEnd"/>
+      <w:r>
+        <w:t>} /&gt;;</w:t>
+      </w:r>
+    </w:p>
+    <w:p>
+      <w:r>
+        <w:t>};</w:t>
+      </w:r>
+    </w:p>
+    <w:p>
+      <w:proofErr w:type="spellStart"/>
+      <w:r>
+        <w:t>const</w:t>
+      </w:r>
+      <w:proofErr w:type="spellEnd"/>
+      <w:r>
+        <w:t xml:space="preserve"> </w:t>
+      </w:r>
+      <w:proofErr w:type="spellStart"/>
+      <w:r>
+        <w:t>InputComponent</w:t>
+      </w:r>
+      <w:proofErr w:type="spellEnd"/>
+      <w:r>
+        <w:t xml:space="preserve"> = </w:t>
+      </w:r>
+      <w:proofErr w:type="gramStart"/>
+      <w:r>
+        <w:t xml:space="preserve">({ </w:t>
+      </w:r>
+      <w:proofErr w:type="spellStart"/>
+      <w:r>
+        <w:t>value</w:t>
+      </w:r>
+      <w:proofErr w:type="spellEnd"/>
+      <w:proofErr w:type="gramEnd"/>
+      <w:r>
+        <w:t xml:space="preserve">, </w:t>
+      </w:r>
+      <w:proofErr w:type="spellStart"/>
+      <w:proofErr w:type="gramStart"/>
+      <w:r>
+        <w:t>onChange</w:t>
+      </w:r>
+      <w:proofErr w:type="spellEnd"/>
+      <w:r>
+        <w:t xml:space="preserve"> }</w:t>
+      </w:r>
+      <w:proofErr w:type="gramEnd"/>
+      <w:r>
+        <w:t>) =&gt; {</w:t>
+      </w:r>
+    </w:p>
+    <w:p>
+      <w:r>
+        <w:t xml:space="preserve">  </w:t>
+      </w:r>
+      <w:proofErr w:type="spellStart"/>
+      <w:r>
+        <w:t>return</w:t>
+      </w:r>
+      <w:proofErr w:type="spellEnd"/>
+      <w:r>
+        <w:t xml:space="preserve"> &lt;input </w:t>
+      </w:r>
+      <w:proofErr w:type="spellStart"/>
+      <w:r>
+        <w:t>type</w:t>
+      </w:r>
+      <w:proofErr w:type="spellEnd"/>
+      <w:r>
+        <w:t>="</w:t>
+      </w:r>
+      <w:proofErr w:type="spellStart"/>
+      <w:r>
+        <w:t>text</w:t>
+      </w:r>
+      <w:proofErr w:type="spellEnd"/>
+      <w:r>
+        <w:t xml:space="preserve">" </w:t>
+      </w:r>
+      <w:proofErr w:type="spellStart"/>
+      <w:r>
+        <w:t>value</w:t>
+      </w:r>
+      <w:proofErr w:type="spellEnd"/>
+      <w:r>
+        <w:t>={</w:t>
+      </w:r>
+      <w:proofErr w:type="spellStart"/>
+      <w:r>
+        <w:t>value</w:t>
+      </w:r>
+      <w:proofErr w:type="spellEnd"/>
+      <w:r>
+        <w:t xml:space="preserve">} </w:t>
+      </w:r>
+      <w:proofErr w:type="spellStart"/>
+      <w:r>
+        <w:t>onChange</w:t>
+      </w:r>
+      <w:proofErr w:type="spellEnd"/>
+      <w:r>
+        <w:t>={</w:t>
+      </w:r>
+      <w:proofErr w:type="spellStart"/>
+      <w:r>
+        <w:t>onChange</w:t>
+      </w:r>
+      <w:proofErr w:type="spellEnd"/>
+      <w:r>
+        <w:t>} /&gt;;</w:t>
+      </w:r>
+    </w:p>
+    <w:p>
+      <w:r>
+        <w:t>};</w:t>
+      </w:r>
+    </w:p>
+    <w:p>
+      <w:pPr>
+        <w:rPr>
+          <w:lang w:val="es-AR"/>
+        </w:rPr>
+      </w:pPr>
+      <w:r>
+        <w:rPr>
+          <w:lang w:val="es-AR"/>
+        </w:rPr>
+        <w:t>En este ejemplo, </w:t>
+      </w:r>
+    </w:p>
+    <w:p>
+      <w:pPr>
+        <w:rPr>
+          <w:lang w:val="es-AR"/>
+        </w:rPr>
+      </w:pPr>
+      <w:proofErr w:type="spellStart"/>
+      <w:r>
+        <w:rPr>
+          <w:lang w:val="es-AR"/>
+        </w:rPr>
+        <w:t>FormContainer</w:t>
+      </w:r>
+      <w:proofErr w:type="spellEnd"/>
+    </w:p>
+    <w:p>
+      <w:pPr>
+        <w:rPr>
+          <w:lang w:val="es-AR"/>
+        </w:rPr>
+      </w:pPr>
+      <w:r>
+        <w:rPr>
+          <w:lang w:val="es-AR"/>
+        </w:rPr>
+        <w:t> gestiona el estado del input y transmite los datos al </w:t>
+      </w:r>
+    </w:p>
+    <w:p>
+      <w:pPr>
+        <w:rPr>
+          <w:lang w:val="es-AR"/>
+        </w:rPr>
+      </w:pPr>
+      <w:proofErr w:type="spellStart"/>
+      <w:r>
+        <w:rPr>
+          <w:lang w:val="es-AR"/>
+        </w:rPr>
+        <w:lastRenderedPageBreak/>
+        <w:t>InputComponent</w:t>
+      </w:r>
+      <w:proofErr w:type="spellEnd"/>
+    </w:p>
+    <w:p>
+      <w:pPr>
+        <w:rPr>
+          <w:lang w:val="es-AR"/>
+        </w:rPr>
+      </w:pPr>
+      <w:r>
+        <w:rPr>
+          <w:lang w:val="es-AR"/>
+        </w:rPr>
+        <w:t>, que solo se encarga de mostrar el campo de texto.</w:t>
+      </w:r>
+    </w:p>
+    <w:p>
+      <w:pPr>
+        <w:rPr>
+          <w:lang w:val="es-AR"/>
+        </w:rPr>
+      </w:pPr>
+      <w:r>
+        <w:rPr>
+          <w:b/>
+          <w:bCs/>
+          <w:lang w:val="es-AR"/>
+        </w:rPr>
+        <w:t>Beneficios de esta clasificación</w:t>
+      </w:r>
+    </w:p>
+    <w:p>
+      <w:pPr>
+        <w:numPr>
+          <w:ilvl w:val="0"/>
+          <w:numId w:val="7"/>
+        </w:numPr>
+        <w:rPr>
+          <w:lang w:val="es-AR"/>
+        </w:rPr>
+      </w:pPr>
+      <w:r>
+        <w:rPr>
+          <w:b/>
+          <w:bCs/>
+          <w:lang w:val="es-AR"/>
+        </w:rPr>
+        <w:t>Separación Clara de Lógica y Presentación:</w:t>
+      </w:r>
+      <w:r>
+        <w:rPr>
+          <w:lang w:val="es-AR"/>
+        </w:rPr>
+        <w:t> Facilita la comprensión del código y permite a los desarrolladores enfocarse en tareas específicas sin mezclar lógica de negocio con aspectos visuales.</w:t>
+      </w:r>
+    </w:p>
+    <w:p>
+      <w:pPr>
+        <w:numPr>
+          <w:ilvl w:val="0"/>
+          <w:numId w:val="7"/>
+        </w:numPr>
+        <w:rPr>
+          <w:lang w:val="es-AR"/>
+        </w:rPr>
+      </w:pPr>
+      <w:r>
+        <w:rPr>
+          <w:b/>
+          <w:bCs/>
+          <w:lang w:val="es-AR"/>
+        </w:rPr>
+        <w:t>Mantenimiento Sencillo:</w:t>
+      </w:r>
+      <w:r>
+        <w:rPr>
+          <w:lang w:val="es-AR"/>
+        </w:rPr>
+        <w:t> Al tener responsabilidades bien definidas, actualizar o modificar componentes es más fácil y menos propenso a errores.</w:t>
+      </w:r>
+    </w:p>
+    <w:p>
+      <w:pPr>
+        <w:numPr>
+          <w:ilvl w:val="0"/>
+          <w:numId w:val="7"/>
+        </w:numPr>
+        <w:rPr>
+          <w:lang w:val="es-AR"/>
+        </w:rPr>
+      </w:pPr>
+      <w:r>
+        <w:rPr>
+          <w:b/>
+          <w:bCs/>
+          <w:lang w:val="es-AR"/>
+        </w:rPr>
+        <w:t>Facilita la Escalabilidad:</w:t>
+      </w:r>
+      <w:r>
+        <w:rPr>
+          <w:lang w:val="es-AR"/>
+        </w:rPr>
+        <w:t> Esta estructura modular permite que aplicaciones complejas se construyan de manera más ordenada y que nuevos componentes se integren sin dificultad.</w:t>
+      </w:r>
+    </w:p>
+    <w:p>
+      <w:pPr>
+        <w:rPr>
+          <w:lang w:val="es-AR"/>
+        </w:rPr>
+      </w:pPr>
+      <w:r>
+        <w:rPr>
+          <w:lang w:val="es-AR"/>
+        </w:rPr>
+        <w:t xml:space="preserve">Entender la clasificación de componentes en </w:t>
+      </w:r>
+      <w:proofErr w:type="spellStart"/>
+      <w:r>
+        <w:rPr>
+          <w:lang w:val="es-AR"/>
+        </w:rPr>
+        <w:t>React</w:t>
+      </w:r>
+      <w:proofErr w:type="spellEnd"/>
+      <w:r>
+        <w:rPr>
+          <w:lang w:val="es-AR"/>
+        </w:rPr>
+        <w:t xml:space="preserve"> y aplicar este enfoque en tus proyectos mejorará la calidad de tu código, hará tu aplicación más mantenible y reducirá el esfuerzo necesario para implementar nuevas funcionalidades.</w:t>
+      </w:r>
+    </w:p>
+    <w:p>
+      <w:pPr>
+        <w:rPr>
+          <w:b/>
+          <w:bCs/>
+          <w:lang w:val="es-AR"/>
+        </w:rPr>
+      </w:pPr>
+      <w:r>
+        <w:rPr>
+          <w:b/>
+          <w:bCs/>
+          <w:lang w:val="es-AR"/>
+        </w:rPr>
+        <w:t xml:space="preserve">La Importancia de los estados en la dinámica de las interfaces </w:t>
+      </w:r>
+      <w:proofErr w:type="spellStart"/>
+      <w:r>
+        <w:rPr>
+          <w:b/>
+          <w:bCs/>
+          <w:lang w:val="es-AR"/>
+        </w:rPr>
+        <w:t>React</w:t>
+      </w:r>
+      <w:proofErr w:type="spellEnd"/>
+    </w:p>
+    <w:p>
+      <w:pPr>
+        <w:rPr>
+          <w:lang w:val="es-AR"/>
+        </w:rPr>
+      </w:pPr>
+      <w:r>
+        <w:rPr>
+          <w:lang w:val="es-AR"/>
+        </w:rPr>
+        <w:t xml:space="preserve">En el desarrollo de aplicaciones web, uno de los desafíos más importantes es gestionar y actualizar la información que se muestra al usuario de manera eficiente y reactiva. </w:t>
+      </w:r>
+      <w:proofErr w:type="spellStart"/>
+      <w:r>
+        <w:rPr>
+          <w:lang w:val="es-AR"/>
+        </w:rPr>
+        <w:t>React</w:t>
+      </w:r>
+      <w:proofErr w:type="spellEnd"/>
+      <w:r>
+        <w:rPr>
+          <w:lang w:val="es-AR"/>
+        </w:rPr>
+        <w:t xml:space="preserve">, una de las bibliotecas más populares para construir interfaces de usuario, resuelve este desafío a través del concepto de estados. Los estados permiten que un componente "recuerde" información entre renderizados, lo que es esencial para crear aplicaciones dinámicas donde la información puede cambiar en respuesta a las interacciones del usuario. Imagina una aplicación de carrito de compras. En este contexto, el estado podría almacenar los productos seleccionados por el usuario, el número de artículos en el carrito o el total a pagar. Cada vez que el usuario agrega o elimina un producto, el estado se actualiza, y </w:t>
+      </w:r>
+      <w:proofErr w:type="spellStart"/>
+      <w:r>
+        <w:rPr>
+          <w:lang w:val="es-AR"/>
+        </w:rPr>
+        <w:t>React</w:t>
+      </w:r>
+      <w:proofErr w:type="spellEnd"/>
+      <w:r>
+        <w:rPr>
+          <w:lang w:val="es-AR"/>
+        </w:rPr>
+        <w:t xml:space="preserve"> se encarga de renderizar nuevamente solo las partes de la interfaz que han cambiado, mostrando la información actualizada al instante. Para manejar estos estados en los componentes funcionales de </w:t>
+      </w:r>
+      <w:proofErr w:type="spellStart"/>
+      <w:r>
+        <w:rPr>
+          <w:lang w:val="es-AR"/>
+        </w:rPr>
+        <w:t>React</w:t>
+      </w:r>
+      <w:proofErr w:type="spellEnd"/>
+      <w:r>
+        <w:rPr>
+          <w:lang w:val="es-AR"/>
+        </w:rPr>
+        <w:t>, existe un concepto clave conocido como "</w:t>
+      </w:r>
+      <w:proofErr w:type="spellStart"/>
+      <w:r>
+        <w:rPr>
+          <w:lang w:val="es-AR"/>
+        </w:rPr>
+        <w:t>hooks</w:t>
+      </w:r>
+      <w:proofErr w:type="spellEnd"/>
+      <w:r>
+        <w:rPr>
+          <w:lang w:val="es-AR"/>
+        </w:rPr>
+        <w:t xml:space="preserve">". Los </w:t>
+      </w:r>
+      <w:proofErr w:type="spellStart"/>
+      <w:r>
+        <w:rPr>
+          <w:lang w:val="es-AR"/>
+        </w:rPr>
+        <w:t>hooks</w:t>
+      </w:r>
+      <w:proofErr w:type="spellEnd"/>
+      <w:r>
+        <w:rPr>
+          <w:lang w:val="es-AR"/>
+        </w:rPr>
+        <w:t xml:space="preserve"> son funciones especiales que permiten acceder a características avanzadas de </w:t>
+      </w:r>
+      <w:proofErr w:type="spellStart"/>
+      <w:r>
+        <w:rPr>
+          <w:lang w:val="es-AR"/>
+        </w:rPr>
+        <w:t>React</w:t>
+      </w:r>
+      <w:proofErr w:type="spellEnd"/>
+      <w:r>
+        <w:rPr>
+          <w:lang w:val="es-AR"/>
+        </w:rPr>
+        <w:t xml:space="preserve">, como el estado o el ciclo de vida del componente, sin la necesidad de escribir componentes basados en clases. Uno de los </w:t>
+      </w:r>
+      <w:proofErr w:type="spellStart"/>
+      <w:r>
+        <w:rPr>
+          <w:lang w:val="es-AR"/>
+        </w:rPr>
+        <w:t>hooks</w:t>
+      </w:r>
+      <w:proofErr w:type="spellEnd"/>
+      <w:r>
+        <w:rPr>
+          <w:lang w:val="es-AR"/>
+        </w:rPr>
+        <w:t xml:space="preserve"> más fundamentales y ampliamente utilizados es </w:t>
+      </w:r>
+      <w:proofErr w:type="spellStart"/>
+      <w:r>
+        <w:rPr>
+          <w:lang w:val="es-AR"/>
+        </w:rPr>
+        <w:t>useState</w:t>
+      </w:r>
+      <w:proofErr w:type="spellEnd"/>
+      <w:r>
+        <w:rPr>
+          <w:lang w:val="es-AR"/>
+        </w:rPr>
+        <w:t xml:space="preserve">. </w:t>
+      </w:r>
+      <w:proofErr w:type="spellStart"/>
+      <w:r>
+        <w:rPr>
+          <w:lang w:val="es-AR"/>
+        </w:rPr>
+        <w:t>useState</w:t>
+      </w:r>
+      <w:proofErr w:type="spellEnd"/>
+      <w:r>
+        <w:rPr>
+          <w:lang w:val="es-AR"/>
+        </w:rPr>
+        <w:t xml:space="preserve"> es la herramienta que permite definir y gestionar estados en los componentes funcionales. Con él, puedes inicializar un estado, modificarlo, y hacer que </w:t>
+      </w:r>
+      <w:proofErr w:type="spellStart"/>
+      <w:r>
+        <w:rPr>
+          <w:lang w:val="es-AR"/>
+        </w:rPr>
+        <w:t>React</w:t>
+      </w:r>
+      <w:proofErr w:type="spellEnd"/>
+      <w:r>
+        <w:rPr>
+          <w:lang w:val="es-AR"/>
+        </w:rPr>
+        <w:t xml:space="preserve"> vuelva a renderizar el componente cada vez que el estado cambia, lo que hace que tu aplicación sea interactiva y reactiva a las acciones del usuario.</w:t>
+      </w:r>
+    </w:p>
+    <w:p>
+      <w:pPr>
+        <w:rPr>
+          <w:lang w:val="es-AR"/>
+        </w:rPr>
+      </w:pPr>
+      <w:r>
+        <w:rPr>
+          <w:lang w:val="es-AR"/>
+        </w:rPr>
+        <w:t xml:space="preserve">Comprender cómo funcionan los estados y cómo se gestionan es esencial para aprovechar al máximo las capacidades de </w:t>
+      </w:r>
+      <w:proofErr w:type="spellStart"/>
+      <w:r>
+        <w:rPr>
+          <w:lang w:val="es-AR"/>
+        </w:rPr>
+        <w:t>React</w:t>
+      </w:r>
+      <w:proofErr w:type="spellEnd"/>
+      <w:r>
+        <w:rPr>
+          <w:lang w:val="es-AR"/>
+        </w:rPr>
+        <w:t xml:space="preserve"> y construir interfaces de usuario que respondan de manera fluida y eficiente a las necesidades de los usuarios. Este conocimiento es un paso fundamental para dominar el desarrollo moderno de aplicaciones web con </w:t>
+      </w:r>
+      <w:proofErr w:type="spellStart"/>
+      <w:r>
+        <w:rPr>
+          <w:lang w:val="es-AR"/>
+        </w:rPr>
+        <w:t>React</w:t>
+      </w:r>
+      <w:proofErr w:type="spellEnd"/>
+      <w:r>
+        <w:rPr>
+          <w:lang w:val="es-AR"/>
+        </w:rPr>
+        <w:t>.</w:t>
+      </w:r>
+    </w:p>
+    <w:p>
+      <w:pPr>
+        <w:rPr>
+          <w:b/>
+          <w:bCs/>
+          <w:lang w:val="es-AR"/>
+        </w:rPr>
+      </w:pPr>
+      <w:r>
+        <w:rPr>
+          <w:b/>
+          <w:bCs/>
+          <w:lang w:val="es-AR"/>
+        </w:rPr>
+        <w:t>Recursos complementarios</w:t>
+      </w:r>
+    </w:p>
+    <w:p>
+      <w:pPr>
+        <w:rPr>
+          <w:lang w:val="es-AR"/>
+        </w:rPr>
+      </w:pPr>
+      <w:r>
+        <w:rPr>
+          <w:lang w:val="es-AR"/>
+        </w:rPr>
+        <w:t xml:space="preserve">- React.js Essentials (1 ed.). </w:t>
+      </w:r>
+      <w:proofErr w:type="gramStart"/>
+      <w:r>
+        <w:rPr>
+          <w:lang w:val="es-AR"/>
+        </w:rPr>
+        <w:t>EEUU</w:t>
+      </w:r>
+      <w:proofErr w:type="gramEnd"/>
+      <w:r>
+        <w:rPr>
+          <w:lang w:val="es-AR"/>
+        </w:rPr>
+        <w:t xml:space="preserve">, </w:t>
+      </w:r>
+      <w:proofErr w:type="spellStart"/>
+      <w:r>
+        <w:rPr>
+          <w:lang w:val="es-AR"/>
+        </w:rPr>
+        <w:t>Packt</w:t>
+      </w:r>
+      <w:proofErr w:type="spellEnd"/>
+      <w:r>
+        <w:rPr>
+          <w:lang w:val="es-AR"/>
+        </w:rPr>
+        <w:t>. | </w:t>
+      </w:r>
+      <w:proofErr w:type="spellStart"/>
+      <w:r>
+        <w:rPr>
+          <w:b/>
+          <w:bCs/>
+          <w:lang w:val="es-AR"/>
+        </w:rPr>
+        <w:t>Fedosejev</w:t>
+      </w:r>
+      <w:proofErr w:type="spellEnd"/>
+      <w:r>
+        <w:rPr>
+          <w:b/>
+          <w:bCs/>
+          <w:lang w:val="es-AR"/>
+        </w:rPr>
+        <w:t>, A. (2015)</w:t>
+      </w:r>
+    </w:p>
+    <w:p>
+      <w:pPr>
+        <w:rPr>
+          <w:lang w:val="es-AR"/>
+        </w:rPr>
+      </w:pPr>
+      <w:r>
+        <w:rPr>
+          <w:lang w:val="es-AR"/>
+        </w:rPr>
+        <w:t xml:space="preserve">- </w:t>
+      </w:r>
+      <w:proofErr w:type="spellStart"/>
+      <w:r>
+        <w:rPr>
+          <w:lang w:val="es-AR"/>
+        </w:rPr>
+        <w:t>ReactJS</w:t>
+      </w:r>
+      <w:proofErr w:type="spellEnd"/>
+      <w:r>
+        <w:rPr>
+          <w:lang w:val="es-AR"/>
+        </w:rPr>
+        <w:t xml:space="preserve"> </w:t>
+      </w:r>
+      <w:proofErr w:type="spellStart"/>
+      <w:r>
+        <w:rPr>
+          <w:lang w:val="es-AR"/>
+        </w:rPr>
+        <w:t>by</w:t>
+      </w:r>
+      <w:proofErr w:type="spellEnd"/>
+      <w:r>
+        <w:rPr>
+          <w:lang w:val="es-AR"/>
+        </w:rPr>
+        <w:t xml:space="preserve"> </w:t>
+      </w:r>
+      <w:proofErr w:type="spellStart"/>
+      <w:r>
+        <w:rPr>
+          <w:lang w:val="es-AR"/>
+        </w:rPr>
+        <w:t>Example</w:t>
+      </w:r>
+      <w:proofErr w:type="spellEnd"/>
+      <w:r>
+        <w:rPr>
+          <w:lang w:val="es-AR"/>
+        </w:rPr>
+        <w:t xml:space="preserve"> (1 ed.). </w:t>
+      </w:r>
+      <w:proofErr w:type="gramStart"/>
+      <w:r>
+        <w:rPr>
+          <w:lang w:val="es-AR"/>
+        </w:rPr>
+        <w:t>EEUU</w:t>
+      </w:r>
+      <w:proofErr w:type="gramEnd"/>
+      <w:r>
+        <w:rPr>
+          <w:lang w:val="es-AR"/>
+        </w:rPr>
+        <w:t xml:space="preserve">, </w:t>
+      </w:r>
+      <w:proofErr w:type="spellStart"/>
+      <w:r>
+        <w:rPr>
+          <w:lang w:val="es-AR"/>
+        </w:rPr>
+        <w:t>Packt</w:t>
+      </w:r>
+      <w:proofErr w:type="spellEnd"/>
+      <w:r>
+        <w:rPr>
+          <w:lang w:val="es-AR"/>
+        </w:rPr>
+        <w:t>. | </w:t>
+      </w:r>
+      <w:proofErr w:type="spellStart"/>
+      <w:r>
+        <w:rPr>
+          <w:b/>
+          <w:bCs/>
+          <w:lang w:val="es-AR"/>
+        </w:rPr>
+        <w:t>Amler</w:t>
+      </w:r>
+      <w:proofErr w:type="spellEnd"/>
+      <w:r>
+        <w:rPr>
+          <w:b/>
+          <w:bCs/>
+          <w:lang w:val="es-AR"/>
+        </w:rPr>
+        <w:t xml:space="preserve"> (2016)</w:t>
+      </w:r>
+    </w:p>
+    <w:p>
+      <w:pPr>
+        <w:rPr>
+          <w:lang w:val="es-AR"/>
+        </w:rPr>
+      </w:pPr>
+      <w:r>
+        <w:rPr>
+          <w:lang w:val="es-AR"/>
+        </w:rPr>
+        <w:lastRenderedPageBreak/>
+        <w:t xml:space="preserve">- </w:t>
+      </w:r>
+      <w:proofErr w:type="spellStart"/>
+      <w:r>
+        <w:rPr>
+          <w:lang w:val="es-AR"/>
+        </w:rPr>
+        <w:t>ReactJS</w:t>
+      </w:r>
+      <w:proofErr w:type="spellEnd"/>
+      <w:r>
+        <w:rPr>
+          <w:lang w:val="es-AR"/>
+        </w:rPr>
+        <w:t xml:space="preserve"> </w:t>
+      </w:r>
+      <w:proofErr w:type="spellStart"/>
+      <w:r>
+        <w:rPr>
+          <w:lang w:val="es-AR"/>
+        </w:rPr>
+        <w:t>Cookbook</w:t>
+      </w:r>
+      <w:proofErr w:type="spellEnd"/>
+      <w:r>
+        <w:rPr>
+          <w:lang w:val="es-AR"/>
+        </w:rPr>
+        <w:t xml:space="preserve"> (1 ed.). </w:t>
+      </w:r>
+      <w:proofErr w:type="gramStart"/>
+      <w:r>
+        <w:rPr>
+          <w:lang w:val="es-AR"/>
+        </w:rPr>
+        <w:t>EEUU</w:t>
+      </w:r>
+      <w:proofErr w:type="gramEnd"/>
+      <w:r>
+        <w:rPr>
+          <w:lang w:val="es-AR"/>
+        </w:rPr>
+        <w:t xml:space="preserve">, </w:t>
+      </w:r>
+      <w:proofErr w:type="spellStart"/>
+      <w:proofErr w:type="gramStart"/>
+      <w:r>
+        <w:rPr>
+          <w:lang w:val="es-AR"/>
+        </w:rPr>
+        <w:t>Packt</w:t>
+      </w:r>
+      <w:proofErr w:type="spellEnd"/>
+      <w:r>
+        <w:rPr>
+          <w:lang w:val="es-AR"/>
+        </w:rPr>
+        <w:t>.|</w:t>
+      </w:r>
+      <w:proofErr w:type="gramEnd"/>
+      <w:r>
+        <w:rPr>
+          <w:lang w:val="es-AR"/>
+        </w:rPr>
+        <w:t> </w:t>
+      </w:r>
+      <w:r>
+        <w:rPr>
+          <w:b/>
+          <w:bCs/>
+          <w:lang w:val="es-AR"/>
+        </w:rPr>
+        <w:t>Stein, J. (2016)</w:t>
+      </w:r>
+    </w:p>
+    <w:p>
+      <w:pPr>
+        <w:rPr>
+          <w:lang w:val="es-AR"/>
+        </w:rPr>
+      </w:pPr>
+      <w:r>
+        <w:rPr>
+          <w:lang w:val="es-AR"/>
+        </w:rPr>
+        <w:t>- </w:t>
+      </w:r>
+      <w:hyperlink r:id="rId10" w:tgtFrame="_blank" w:history="1">
+        <w:r>
+          <w:rPr>
+            <w:rStyle w:val="Hipervnculo"/>
+            <w:lang w:val="es-AR"/>
+          </w:rPr>
+          <w:t>https://caniuse.com</w:t>
+        </w:r>
+      </w:hyperlink>
+      <w:r>
+        <w:rPr>
+          <w:lang w:val="es-AR"/>
+        </w:rPr>
+        <w:t> | </w:t>
+      </w:r>
+      <w:r>
+        <w:rPr>
+          <w:b/>
+          <w:bCs/>
+          <w:lang w:val="es-AR"/>
+        </w:rPr>
+        <w:t>Can I use</w:t>
+      </w:r>
+    </w:p>
+    <w:p>
+      <w:pPr>
+        <w:rPr>
+          <w:b/>
+          <w:bCs/>
+          <w:lang w:val="es-AR"/>
+        </w:rPr>
+      </w:pPr>
+      <w:r>
+        <w:rPr>
+          <w:b/>
+          <w:bCs/>
+          <w:lang w:val="es-AR"/>
+        </w:rPr>
+        <w:t>Scripts</w:t>
+      </w:r>
+    </w:p>
+    <w:p>
+      <w:pPr>
+        <w:numPr>
+          <w:ilvl w:val="0"/>
+          <w:numId w:val="8"/>
+        </w:numPr>
+        <w:rPr>
+          <w:lang w:val="es-AR"/>
+        </w:rPr>
+      </w:pPr>
+      <w:hyperlink r:id="rId11" w:tgtFrame="_blank" w:history="1">
+        <w:r>
+          <w:rPr>
+            <w:rStyle w:val="Hipervnculo"/>
+            <w:lang w:val="es-AR"/>
+          </w:rPr>
+          <w:t>JSX</w:t>
+        </w:r>
+      </w:hyperlink>
+    </w:p>
+    <w:p>
+      <w:pPr>
+        <w:numPr>
+          <w:ilvl w:val="0"/>
+          <w:numId w:val="8"/>
+        </w:numPr>
+        <w:rPr>
+          <w:lang w:val="es-AR"/>
+        </w:rPr>
+      </w:pPr>
+      <w:hyperlink r:id="rId12" w:tgtFrame="_blank" w:history="1">
+        <w:r>
+          <w:rPr>
+            <w:rStyle w:val="Hipervnculo"/>
+            <w:lang w:val="es-AR"/>
+          </w:rPr>
+          <w:t xml:space="preserve">Componentes y </w:t>
+        </w:r>
+        <w:proofErr w:type="spellStart"/>
+        <w:r>
+          <w:rPr>
+            <w:rStyle w:val="Hipervnculo"/>
+            <w:lang w:val="es-AR"/>
+          </w:rPr>
+          <w:t>props</w:t>
+        </w:r>
+        <w:proofErr w:type="spellEnd"/>
+      </w:hyperlink>
+    </w:p>
+    <w:p>
+      <w:pPr>
+        <w:numPr>
+          <w:ilvl w:val="0"/>
+          <w:numId w:val="8"/>
+        </w:numPr>
+        <w:rPr>
+          <w:lang w:val="es-AR"/>
+        </w:rPr>
+      </w:pPr>
+      <w:hyperlink r:id="rId13" w:tgtFrame="_blank" w:history="1">
+        <w:proofErr w:type="spellStart"/>
+        <w:r>
+          <w:rPr>
+            <w:rStyle w:val="Hipervnculo"/>
+            <w:lang w:val="es-AR"/>
+          </w:rPr>
+          <w:t>useS</w:t>
+        </w:r>
+        <w:r>
+          <w:rPr>
+            <w:rStyle w:val="Hipervnculo"/>
+            <w:lang w:val="es-AR"/>
+          </w:rPr>
+          <w:t>t</w:t>
+        </w:r>
+        <w:r>
+          <w:rPr>
+            <w:rStyle w:val="Hipervnculo"/>
+            <w:lang w:val="es-AR"/>
+          </w:rPr>
+          <w:t>ate</w:t>
+        </w:r>
+        <w:proofErr w:type="spellEnd"/>
+      </w:hyperlink>
+    </w:p>
+    <w:p>
+      <w:pPr>
+        <w:numPr>
+          <w:ilvl w:val="0"/>
+          <w:numId w:val="8"/>
+        </w:numPr>
+        <w:rPr>
+          <w:lang w:val="es-AR"/>
+        </w:rPr>
+      </w:pPr>
+      <w:hyperlink r:id="rId14" w:tgtFrame="_blank" w:history="1">
+        <w:proofErr w:type="spellStart"/>
+        <w:r>
+          <w:rPr>
+            <w:rStyle w:val="Hipervnculo"/>
+            <w:lang w:val="es-AR"/>
+          </w:rPr>
+          <w:t>Pratón</w:t>
+        </w:r>
+        <w:proofErr w:type="spellEnd"/>
+        <w:r>
+          <w:rPr>
+            <w:rStyle w:val="Hipervnculo"/>
+            <w:lang w:val="es-AR"/>
+          </w:rPr>
+          <w:t xml:space="preserve"> contenedor/presentación</w:t>
+        </w:r>
+      </w:hyperlink>
+    </w:p>
+    <w:p>
+      <w:pPr>
+        <w:pStyle w:val="Prrafodelista"/>
+        <w:numPr>
+          <w:ilvl w:val="0"/>
+          <w:numId w:val="8"/>
+        </w:numPr>
+        <w:pBdr>
+          <w:top w:val="single" w:sz="2" w:space="12" w:color="auto"/>
+          <w:left w:val="single" w:sz="2" w:space="0" w:color="auto"/>
+          <w:bottom w:val="single" w:sz="2" w:space="0" w:color="auto"/>
+          <w:right w:val="single" w:sz="2" w:space="0" w:color="auto"/>
+        </w:pBdr>
+        <w:shd w:val="clear" w:color="auto" w:fill="1F2233"/>
+        <w:spacing w:after="240" w:line="420" w:lineRule="atLeast"/>
+        <w:outlineLvl w:val="0"/>
+        <w:rPr>
+          <w:rFonts w:ascii="Inter" w:eastAsia="Times New Roman" w:hAnsi="Inter" w:cs="Times New Roman"/>
+          <w:b/>
+          <w:bCs/>
+          <w:color w:val="FFFFFF"/>
+          <w:kern w:val="36"/>
+          <w:sz w:val="36"/>
+          <w:szCs w:val="36"/>
+          <w:lang w:val="es-AR" w:eastAsia="es-AR"/>
+          <w14:ligatures w14:val="none"/>
+        </w:rPr>
+      </w:pPr>
+      <w:r>
+        <w:rPr>
+          <w:rFonts w:ascii="Inter" w:eastAsia="Times New Roman" w:hAnsi="Inter" w:cs="Times New Roman"/>
+          <w:b/>
+          <w:bCs/>
+          <w:color w:val="FFFFFF"/>
+          <w:kern w:val="36"/>
+          <w:sz w:val="36"/>
+          <w:szCs w:val="36"/>
+          <w:lang w:val="es-AR" w:eastAsia="es-AR"/>
+          <w14:ligatures w14:val="none"/>
+        </w:rPr>
+        <w:t>Actividades prácticas</w:t>
+      </w:r>
+    </w:p>
+    <w:p>
+      <w:pPr>
+        <w:pStyle w:val="Prrafodelista"/>
+        <w:numPr>
+          <w:ilvl w:val="0"/>
+          <w:numId w:val="8"/>
+        </w:numPr>
+        <w:pBdr>
+          <w:top w:val="single" w:sz="2" w:space="12" w:color="auto"/>
+          <w:left w:val="single" w:sz="2" w:space="0" w:color="auto"/>
+          <w:bottom w:val="single" w:sz="2" w:space="0" w:color="auto"/>
+          <w:right w:val="single" w:sz="2" w:space="0" w:color="auto"/>
+        </w:pBdr>
+        <w:shd w:val="clear" w:color="auto" w:fill="1F2233"/>
+        <w:spacing w:after="240" w:line="240" w:lineRule="auto"/>
+        <w:outlineLvl w:val="1"/>
+        <w:rPr>
+          <w:rFonts w:ascii="Segoe UI" w:eastAsia="Times New Roman" w:hAnsi="Segoe UI" w:cs="Segoe UI"/>
+          <w:b/>
+          <w:bCs/>
+          <w:color w:val="FFFFFF"/>
+          <w:kern w:val="0"/>
+          <w:sz w:val="36"/>
+          <w:szCs w:val="36"/>
+          <w:lang w:val="es-AR" w:eastAsia="es-AR"/>
+          <w14:ligatures w14:val="none"/>
+        </w:rPr>
+      </w:pPr>
+      <w:r>
+        <w:rPr>
+          <w:rFonts w:ascii="Segoe UI" w:eastAsia="Times New Roman" w:hAnsi="Segoe UI" w:cs="Segoe UI"/>
+          <w:b/>
+          <w:bCs/>
+          <w:color w:val="FFFFFF"/>
+          <w:kern w:val="0"/>
+          <w:sz w:val="36"/>
+          <w:szCs w:val="36"/>
+          <w:bdr w:val="single" w:sz="2" w:space="0" w:color="auto" w:frame="1"/>
+          <w:lang w:val="es-AR" w:eastAsia="es-AR"/>
+          <w14:ligatures w14:val="none"/>
+        </w:rPr>
+        <w:t xml:space="preserve">Actividad 1: Transformando </w:t>
+      </w:r>
+      <w:proofErr w:type="spellStart"/>
+      <w:r>
+        <w:rPr>
+          <w:rFonts w:ascii="Segoe UI" w:eastAsia="Times New Roman" w:hAnsi="Segoe UI" w:cs="Segoe UI"/>
+          <w:b/>
+          <w:bCs/>
+          <w:color w:val="FFFFFF"/>
+          <w:kern w:val="0"/>
+          <w:sz w:val="36"/>
+          <w:szCs w:val="36"/>
+          <w:bdr w:val="single" w:sz="2" w:space="0" w:color="auto" w:frame="1"/>
+          <w:lang w:val="es-AR" w:eastAsia="es-AR"/>
+          <w14:ligatures w14:val="none"/>
+        </w:rPr>
+        <w:t>Arrays</w:t>
+      </w:r>
+      <w:proofErr w:type="spellEnd"/>
+    </w:p>
+    <w:p>
+      <w:pPr>
+        <w:pStyle w:val="Prrafodelista"/>
+        <w:numPr>
+          <w:ilvl w:val="0"/>
+          <w:numId w:val="8"/>
+        </w:numPr>
+        <w:pBdr>
+          <w:top w:val="single" w:sz="2" w:space="0" w:color="auto"/>
+          <w:left w:val="single" w:sz="2" w:space="0" w:color="auto"/>
+          <w:bottom w:val="single" w:sz="2" w:space="0" w:color="auto"/>
+          <w:right w:val="single" w:sz="2" w:space="0" w:color="auto"/>
+        </w:pBdr>
+        <w:shd w:val="clear" w:color="auto" w:fill="1F2233"/>
+        <w:spacing w:after="240" w:line="300" w:lineRule="atLeast"/>
+        <w:rPr>
+          <w:rFonts w:ascii="Inter" w:eastAsia="Times New Roman" w:hAnsi="Inter" w:cs="Times New Roman"/>
+          <w:color w:val="FFFFFF"/>
+          <w:kern w:val="0"/>
+          <w:sz w:val="21"/>
+          <w:szCs w:val="21"/>
+          <w:lang w:val="es-AR" w:eastAsia="es-AR"/>
+          <w14:ligatures w14:val="none"/>
+        </w:rPr>
+      </w:pPr>
+      <w:r>
+        <w:rPr>
+          <w:rFonts w:ascii="Inter" w:eastAsia="Times New Roman" w:hAnsi="Inter" w:cs="Times New Roman"/>
+          <w:color w:val="FFFFFF"/>
+          <w:kern w:val="0"/>
+          <w:sz w:val="21"/>
+          <w:szCs w:val="21"/>
+          <w:lang w:val="es-AR" w:eastAsia="es-AR"/>
+          <w14:ligatures w14:val="none"/>
+        </w:rPr>
+        <w:t xml:space="preserve">Implementar un </w:t>
+      </w:r>
+      <w:proofErr w:type="spellStart"/>
+      <w:r>
+        <w:rPr>
+          <w:rFonts w:ascii="Inter" w:eastAsia="Times New Roman" w:hAnsi="Inter" w:cs="Times New Roman"/>
+          <w:color w:val="FFFFFF"/>
+          <w:kern w:val="0"/>
+          <w:sz w:val="21"/>
+          <w:szCs w:val="21"/>
+          <w:lang w:val="es-AR" w:eastAsia="es-AR"/>
+          <w14:ligatures w14:val="none"/>
+        </w:rPr>
+        <w:t>polyfills</w:t>
+      </w:r>
+      <w:proofErr w:type="spellEnd"/>
+      <w:r>
+        <w:rPr>
+          <w:rFonts w:ascii="Inter" w:eastAsia="Times New Roman" w:hAnsi="Inter" w:cs="Times New Roman"/>
+          <w:color w:val="FFFFFF"/>
+          <w:kern w:val="0"/>
+          <w:sz w:val="21"/>
+          <w:szCs w:val="21"/>
+          <w:lang w:val="es-AR" w:eastAsia="es-AR"/>
+          <w14:ligatures w14:val="none"/>
+        </w:rPr>
+        <w:t xml:space="preserve"> del método </w:t>
+      </w:r>
+      <w:proofErr w:type="spellStart"/>
+      <w:r>
+        <w:rPr>
+          <w:rFonts w:ascii="Inter" w:eastAsia="Times New Roman" w:hAnsi="Inter" w:cs="Times New Roman"/>
+          <w:color w:val="FFFFFF"/>
+          <w:kern w:val="0"/>
+          <w:sz w:val="21"/>
+          <w:szCs w:val="21"/>
+          <w:lang w:val="es-AR" w:eastAsia="es-AR"/>
+          <w14:ligatures w14:val="none"/>
+        </w:rPr>
+        <w:t>map</w:t>
+      </w:r>
+      <w:proofErr w:type="spellEnd"/>
+      <w:r>
+        <w:rPr>
+          <w:rFonts w:ascii="Inter" w:eastAsia="Times New Roman" w:hAnsi="Inter" w:cs="Times New Roman"/>
+          <w:color w:val="FFFFFF"/>
+          <w:kern w:val="0"/>
+          <w:sz w:val="21"/>
+          <w:szCs w:val="21"/>
+          <w:lang w:val="es-AR" w:eastAsia="es-AR"/>
+          <w14:ligatures w14:val="none"/>
+        </w:rPr>
+        <w:t xml:space="preserve"> de los </w:t>
+      </w:r>
+      <w:proofErr w:type="spellStart"/>
+      <w:r>
+        <w:rPr>
+          <w:rFonts w:ascii="Inter" w:eastAsia="Times New Roman" w:hAnsi="Inter" w:cs="Times New Roman"/>
+          <w:color w:val="FFFFFF"/>
+          <w:kern w:val="0"/>
+          <w:sz w:val="21"/>
+          <w:szCs w:val="21"/>
+          <w:lang w:val="es-AR" w:eastAsia="es-AR"/>
+          <w14:ligatures w14:val="none"/>
+        </w:rPr>
+        <w:t>arrays</w:t>
+      </w:r>
+      <w:proofErr w:type="spellEnd"/>
+      <w:r>
+        <w:rPr>
+          <w:rFonts w:ascii="Inter" w:eastAsia="Times New Roman" w:hAnsi="Inter" w:cs="Times New Roman"/>
+          <w:color w:val="FFFFFF"/>
+          <w:kern w:val="0"/>
+          <w:sz w:val="21"/>
+          <w:szCs w:val="21"/>
+          <w:lang w:val="es-AR" w:eastAsia="es-AR"/>
+          <w14:ligatures w14:val="none"/>
+        </w:rPr>
+        <w:t>. Debemos suponer que los navegadores no son compatibles con este método y debemos implementarlo para que todos puedan usarlo en nuestra aplicación.</w:t>
+      </w:r>
+    </w:p>
+    <w:p>
+      <w:pPr>
+        <w:pStyle w:val="Prrafodelista"/>
+        <w:numPr>
+          <w:ilvl w:val="0"/>
+          <w:numId w:val="8"/>
+        </w:numPr>
+        <w:pBdr>
+          <w:top w:val="single" w:sz="2" w:space="0" w:color="auto"/>
+          <w:left w:val="single" w:sz="2" w:space="0" w:color="auto"/>
+          <w:bottom w:val="single" w:sz="2" w:space="0" w:color="auto"/>
+          <w:right w:val="single" w:sz="2" w:space="0" w:color="auto"/>
+        </w:pBdr>
+        <w:shd w:val="clear" w:color="auto" w:fill="1F2233"/>
+        <w:spacing w:after="240" w:line="300" w:lineRule="atLeast"/>
+        <w:rPr>
+          <w:rFonts w:ascii="Inter" w:eastAsia="Times New Roman" w:hAnsi="Inter" w:cs="Times New Roman"/>
+          <w:color w:val="FFFFFF"/>
+          <w:kern w:val="0"/>
+          <w:sz w:val="21"/>
+          <w:szCs w:val="21"/>
+          <w:lang w:val="es-AR" w:eastAsia="es-AR"/>
+          <w14:ligatures w14:val="none"/>
+        </w:rPr>
+      </w:pPr>
+      <w:r>
+        <w:rPr>
+          <w:rFonts w:ascii="Segoe UI Emoji" w:eastAsia="Times New Roman" w:hAnsi="Segoe UI Emoji" w:cs="Segoe UI Emoji"/>
+          <w:color w:val="FFFFFF"/>
+          <w:kern w:val="0"/>
+          <w:sz w:val="21"/>
+          <w:szCs w:val="21"/>
+          <w:lang w:val="es-AR" w:eastAsia="es-AR"/>
+          <w14:ligatures w14:val="none"/>
+        </w:rPr>
+        <w:t>💡</w:t>
+      </w:r>
+      <w:proofErr w:type="spellStart"/>
+      <w:r>
+        <w:rPr>
+          <w:rFonts w:ascii="Inter" w:eastAsia="Times New Roman" w:hAnsi="Inter" w:cs="Times New Roman"/>
+          <w:b/>
+          <w:bCs/>
+          <w:color w:val="FFFFFF"/>
+          <w:kern w:val="0"/>
+          <w:sz w:val="21"/>
+          <w:szCs w:val="21"/>
+          <w:bdr w:val="single" w:sz="2" w:space="0" w:color="auto" w:frame="1"/>
+          <w:lang w:val="es-AR" w:eastAsia="es-AR"/>
+          <w14:ligatures w14:val="none"/>
+        </w:rPr>
+        <w:t>Tips</w:t>
+      </w:r>
+      <w:proofErr w:type="spellEnd"/>
+    </w:p>
+    <w:p>
+      <w:pPr>
+        <w:pStyle w:val="Prrafodelista"/>
+        <w:numPr>
+          <w:ilvl w:val="0"/>
+          <w:numId w:val="8"/>
+        </w:numPr>
+        <w:pBdr>
+          <w:top w:val="single" w:sz="2" w:space="0" w:color="auto"/>
+          <w:left w:val="single" w:sz="2" w:space="0" w:color="auto"/>
+          <w:bottom w:val="single" w:sz="2" w:space="0" w:color="auto"/>
+          <w:right w:val="single" w:sz="2" w:space="0" w:color="auto"/>
+        </w:pBdr>
+        <w:shd w:val="clear" w:color="auto" w:fill="1F2233"/>
+        <w:spacing w:after="240" w:line="300" w:lineRule="atLeast"/>
+        <w:rPr>
+          <w:rFonts w:ascii="Inter" w:eastAsia="Times New Roman" w:hAnsi="Inter" w:cs="Times New Roman"/>
+          <w:color w:val="FFFFFF"/>
+          <w:kern w:val="0"/>
+          <w:sz w:val="21"/>
+          <w:szCs w:val="21"/>
+          <w:lang w:val="es-AR" w:eastAsia="es-AR"/>
+          <w14:ligatures w14:val="none"/>
+        </w:rPr>
+      </w:pPr>
+      <w:r>
+        <w:rPr>
+          <w:rFonts w:ascii="Inter" w:eastAsia="Times New Roman" w:hAnsi="Inter" w:cs="Times New Roman"/>
+          <w:color w:val="FFFFFF"/>
+          <w:kern w:val="0"/>
+          <w:sz w:val="21"/>
+          <w:szCs w:val="21"/>
+          <w:lang w:val="es-AR" w:eastAsia="es-AR"/>
+          <w14:ligatures w14:val="none"/>
+        </w:rPr>
+        <w:t xml:space="preserve">Es necesario utilizar </w:t>
+      </w:r>
+      <w:proofErr w:type="gramStart"/>
+      <w:r>
+        <w:rPr>
+          <w:rFonts w:ascii="Inter" w:eastAsia="Times New Roman" w:hAnsi="Inter" w:cs="Times New Roman"/>
+          <w:color w:val="FFFFFF"/>
+          <w:kern w:val="0"/>
+          <w:sz w:val="21"/>
+          <w:szCs w:val="21"/>
+          <w:lang w:val="es-AR" w:eastAsia="es-AR"/>
+          <w14:ligatures w14:val="none"/>
+        </w:rPr>
+        <w:t>el objetos</w:t>
+      </w:r>
+      <w:proofErr w:type="gramEnd"/>
+      <w:r>
+        <w:rPr>
+          <w:rFonts w:ascii="Inter" w:eastAsia="Times New Roman" w:hAnsi="Inter" w:cs="Times New Roman"/>
+          <w:color w:val="FFFFFF"/>
+          <w:kern w:val="0"/>
+          <w:sz w:val="21"/>
+          <w:szCs w:val="21"/>
+          <w:lang w:val="es-AR" w:eastAsia="es-AR"/>
+          <w14:ligatures w14:val="none"/>
+        </w:rPr>
+        <w:t xml:space="preserve"> </w:t>
+      </w:r>
+      <w:proofErr w:type="spellStart"/>
+      <w:r>
+        <w:rPr>
+          <w:rFonts w:ascii="Inter" w:eastAsia="Times New Roman" w:hAnsi="Inter" w:cs="Times New Roman"/>
+          <w:color w:val="FFFFFF"/>
+          <w:kern w:val="0"/>
+          <w:sz w:val="21"/>
+          <w:szCs w:val="21"/>
+          <w:lang w:val="es-AR" w:eastAsia="es-AR"/>
+          <w14:ligatures w14:val="none"/>
+        </w:rPr>
+        <w:t>this</w:t>
+      </w:r>
+      <w:proofErr w:type="spellEnd"/>
+      <w:r>
+        <w:rPr>
+          <w:rFonts w:ascii="Inter" w:eastAsia="Times New Roman" w:hAnsi="Inter" w:cs="Times New Roman"/>
+          <w:color w:val="FFFFFF"/>
+          <w:kern w:val="0"/>
+          <w:sz w:val="21"/>
+          <w:szCs w:val="21"/>
+          <w:lang w:val="es-AR" w:eastAsia="es-AR"/>
+          <w14:ligatures w14:val="none"/>
+        </w:rPr>
+        <w:t xml:space="preserve">, que en este caso va a hacer referencia al dueño de la función </w:t>
+      </w:r>
+      <w:proofErr w:type="spellStart"/>
+      <w:r>
+        <w:rPr>
+          <w:rFonts w:ascii="Inter" w:eastAsia="Times New Roman" w:hAnsi="Inter" w:cs="Times New Roman"/>
+          <w:color w:val="FFFFFF"/>
+          <w:kern w:val="0"/>
+          <w:sz w:val="21"/>
+          <w:szCs w:val="21"/>
+          <w:lang w:val="es-AR" w:eastAsia="es-AR"/>
+          <w14:ligatures w14:val="none"/>
+        </w:rPr>
+        <w:t>map</w:t>
+      </w:r>
+      <w:proofErr w:type="spellEnd"/>
+      <w:r>
+        <w:rPr>
+          <w:rFonts w:ascii="Inter" w:eastAsia="Times New Roman" w:hAnsi="Inter" w:cs="Times New Roman"/>
+          <w:color w:val="FFFFFF"/>
+          <w:kern w:val="0"/>
+          <w:sz w:val="21"/>
+          <w:szCs w:val="21"/>
+          <w:lang w:val="es-AR" w:eastAsia="es-AR"/>
+          <w14:ligatures w14:val="none"/>
+        </w:rPr>
+        <w:t xml:space="preserve"> que es ejecutada. Por eso mismo, necesitaremos de una función regular y no una </w:t>
+      </w:r>
+      <w:proofErr w:type="spellStart"/>
+      <w:r>
+        <w:rPr>
+          <w:rFonts w:ascii="Inter" w:eastAsia="Times New Roman" w:hAnsi="Inter" w:cs="Times New Roman"/>
+          <w:color w:val="FFFFFF"/>
+          <w:kern w:val="0"/>
+          <w:sz w:val="21"/>
+          <w:szCs w:val="21"/>
+          <w:lang w:val="es-AR" w:eastAsia="es-AR"/>
+          <w14:ligatures w14:val="none"/>
+        </w:rPr>
+        <w:t>arrow</w:t>
+      </w:r>
+      <w:proofErr w:type="spellEnd"/>
+      <w:r>
+        <w:rPr>
+          <w:rFonts w:ascii="Inter" w:eastAsia="Times New Roman" w:hAnsi="Inter" w:cs="Times New Roman"/>
+          <w:color w:val="FFFFFF"/>
+          <w:kern w:val="0"/>
+          <w:sz w:val="21"/>
+          <w:szCs w:val="21"/>
+          <w:lang w:val="es-AR" w:eastAsia="es-AR"/>
+          <w14:ligatures w14:val="none"/>
+        </w:rPr>
+        <w:t xml:space="preserve"> </w:t>
+      </w:r>
+      <w:proofErr w:type="spellStart"/>
+      <w:r>
+        <w:rPr>
+          <w:rFonts w:ascii="Inter" w:eastAsia="Times New Roman" w:hAnsi="Inter" w:cs="Times New Roman"/>
+          <w:color w:val="FFFFFF"/>
+          <w:kern w:val="0"/>
+          <w:sz w:val="21"/>
+          <w:szCs w:val="21"/>
+          <w:lang w:val="es-AR" w:eastAsia="es-AR"/>
+          <w14:ligatures w14:val="none"/>
+        </w:rPr>
+        <w:t>function</w:t>
+      </w:r>
+      <w:proofErr w:type="spellEnd"/>
+      <w:r>
+        <w:rPr>
+          <w:rFonts w:ascii="Inter" w:eastAsia="Times New Roman" w:hAnsi="Inter" w:cs="Times New Roman"/>
+          <w:color w:val="FFFFFF"/>
+          <w:kern w:val="0"/>
+          <w:sz w:val="21"/>
+          <w:szCs w:val="21"/>
+          <w:lang w:val="es-AR" w:eastAsia="es-AR"/>
+          <w14:ligatures w14:val="none"/>
+        </w:rPr>
+        <w:t xml:space="preserve">. </w:t>
+      </w:r>
+      <w:proofErr w:type="gramStart"/>
+      <w:r>
+        <w:rPr>
+          <w:rFonts w:ascii="Inter" w:eastAsia="Times New Roman" w:hAnsi="Inter" w:cs="Times New Roman"/>
+          <w:color w:val="FFFFFF"/>
+          <w:kern w:val="0"/>
+          <w:sz w:val="21"/>
+          <w:szCs w:val="21"/>
+          <w:lang w:val="es-AR" w:eastAsia="es-AR"/>
+          <w14:ligatures w14:val="none"/>
+        </w:rPr>
+        <w:t>Recordar</w:t>
+      </w:r>
+      <w:proofErr w:type="gramEnd"/>
+      <w:r>
+        <w:rPr>
+          <w:rFonts w:ascii="Inter" w:eastAsia="Times New Roman" w:hAnsi="Inter" w:cs="Times New Roman"/>
+          <w:color w:val="FFFFFF"/>
+          <w:kern w:val="0"/>
+          <w:sz w:val="21"/>
+          <w:szCs w:val="21"/>
+          <w:lang w:val="es-AR" w:eastAsia="es-AR"/>
+          <w14:ligatures w14:val="none"/>
+        </w:rPr>
+        <w:t xml:space="preserve"> que necesitamos RETORNAR el array transformado.</w:t>
+      </w:r>
+    </w:p>
+    <w:p>
+      <w:pPr>
+        <w:pStyle w:val="Prrafodelista"/>
+        <w:numPr>
+          <w:ilvl w:val="0"/>
+          <w:numId w:val="8"/>
+        </w:numPr>
+        <w:pBdr>
+          <w:top w:val="single" w:sz="2" w:space="12" w:color="auto"/>
+          <w:left w:val="single" w:sz="2" w:space="0" w:color="auto"/>
+          <w:bottom w:val="single" w:sz="2" w:space="0" w:color="auto"/>
+          <w:right w:val="single" w:sz="2" w:space="0" w:color="auto"/>
+        </w:pBdr>
+        <w:shd w:val="clear" w:color="auto" w:fill="1F2233"/>
+        <w:spacing w:after="240" w:line="240" w:lineRule="auto"/>
+        <w:outlineLvl w:val="1"/>
+        <w:rPr>
+          <w:rFonts w:ascii="Segoe UI" w:eastAsia="Times New Roman" w:hAnsi="Segoe UI" w:cs="Segoe UI"/>
+          <w:b/>
+          <w:bCs/>
+          <w:color w:val="FFFFFF"/>
+          <w:kern w:val="0"/>
+          <w:sz w:val="36"/>
+          <w:szCs w:val="36"/>
+          <w:lang w:val="es-AR" w:eastAsia="es-AR"/>
+          <w14:ligatures w14:val="none"/>
+        </w:rPr>
+      </w:pPr>
+      <w:r>
+        <w:rPr>
+          <w:rFonts w:ascii="Segoe UI" w:eastAsia="Times New Roman" w:hAnsi="Segoe UI" w:cs="Segoe UI"/>
+          <w:b/>
+          <w:bCs/>
+          <w:color w:val="FFFFFF"/>
+          <w:kern w:val="0"/>
+          <w:sz w:val="36"/>
+          <w:szCs w:val="36"/>
+          <w:bdr w:val="single" w:sz="2" w:space="0" w:color="auto" w:frame="1"/>
+          <w:lang w:val="es-AR" w:eastAsia="es-AR"/>
+          <w14:ligatures w14:val="none"/>
+        </w:rPr>
+        <w:t xml:space="preserve">Actividad 2: Filtrando </w:t>
+      </w:r>
+      <w:proofErr w:type="spellStart"/>
+      <w:r>
+        <w:rPr>
+          <w:rFonts w:ascii="Segoe UI" w:eastAsia="Times New Roman" w:hAnsi="Segoe UI" w:cs="Segoe UI"/>
+          <w:b/>
+          <w:bCs/>
+          <w:color w:val="FFFFFF"/>
+          <w:kern w:val="0"/>
+          <w:sz w:val="36"/>
+          <w:szCs w:val="36"/>
+          <w:bdr w:val="single" w:sz="2" w:space="0" w:color="auto" w:frame="1"/>
+          <w:lang w:val="es-AR" w:eastAsia="es-AR"/>
+          <w14:ligatures w14:val="none"/>
+        </w:rPr>
+        <w:t>Arrays</w:t>
+      </w:r>
+      <w:proofErr w:type="spellEnd"/>
+    </w:p>
+    <w:p>
+      <w:pPr>
+        <w:pStyle w:val="Prrafodelista"/>
+        <w:numPr>
+          <w:ilvl w:val="0"/>
+          <w:numId w:val="8"/>
+        </w:numPr>
+        <w:pBdr>
+          <w:top w:val="single" w:sz="2" w:space="0" w:color="auto"/>
+          <w:left w:val="single" w:sz="2" w:space="0" w:color="auto"/>
+          <w:bottom w:val="single" w:sz="2" w:space="0" w:color="auto"/>
+          <w:right w:val="single" w:sz="2" w:space="0" w:color="auto"/>
+        </w:pBdr>
+        <w:shd w:val="clear" w:color="auto" w:fill="1F2233"/>
+        <w:spacing w:after="240" w:line="300" w:lineRule="atLeast"/>
+        <w:rPr>
+          <w:rFonts w:ascii="Inter" w:eastAsia="Times New Roman" w:hAnsi="Inter" w:cs="Times New Roman"/>
+          <w:color w:val="FFFFFF"/>
+          <w:kern w:val="0"/>
+          <w:sz w:val="21"/>
+          <w:szCs w:val="21"/>
+          <w:lang w:val="es-AR" w:eastAsia="es-AR"/>
+          <w14:ligatures w14:val="none"/>
+        </w:rPr>
+      </w:pPr>
+      <w:r>
+        <w:rPr>
+          <w:rFonts w:ascii="Inter" w:eastAsia="Times New Roman" w:hAnsi="Inter" w:cs="Times New Roman"/>
+          <w:color w:val="FFFFFF"/>
+          <w:kern w:val="0"/>
+          <w:sz w:val="21"/>
+          <w:szCs w:val="21"/>
+          <w:lang w:val="es-AR" w:eastAsia="es-AR"/>
+          <w14:ligatures w14:val="none"/>
+        </w:rPr>
+        <w:t xml:space="preserve">Del mismo modo podemos implementar un </w:t>
+      </w:r>
+      <w:proofErr w:type="spellStart"/>
+      <w:r>
+        <w:rPr>
+          <w:rFonts w:ascii="Inter" w:eastAsia="Times New Roman" w:hAnsi="Inter" w:cs="Times New Roman"/>
+          <w:color w:val="FFFFFF"/>
+          <w:kern w:val="0"/>
+          <w:sz w:val="21"/>
+          <w:szCs w:val="21"/>
+          <w:lang w:val="es-AR" w:eastAsia="es-AR"/>
+          <w14:ligatures w14:val="none"/>
+        </w:rPr>
+        <w:t>polyfill</w:t>
+      </w:r>
+      <w:proofErr w:type="spellEnd"/>
+      <w:r>
+        <w:rPr>
+          <w:rFonts w:ascii="Inter" w:eastAsia="Times New Roman" w:hAnsi="Inter" w:cs="Times New Roman"/>
+          <w:color w:val="FFFFFF"/>
+          <w:kern w:val="0"/>
+          <w:sz w:val="21"/>
+          <w:szCs w:val="21"/>
+          <w:lang w:val="es-AR" w:eastAsia="es-AR"/>
+          <w14:ligatures w14:val="none"/>
+        </w:rPr>
+        <w:t xml:space="preserve"> para el método </w:t>
+      </w:r>
+      <w:proofErr w:type="spellStart"/>
+      <w:r>
+        <w:rPr>
+          <w:rFonts w:ascii="Inter" w:eastAsia="Times New Roman" w:hAnsi="Inter" w:cs="Times New Roman"/>
+          <w:color w:val="FFFFFF"/>
+          <w:kern w:val="0"/>
+          <w:sz w:val="21"/>
+          <w:szCs w:val="21"/>
+          <w:lang w:val="es-AR" w:eastAsia="es-AR"/>
+          <w14:ligatures w14:val="none"/>
+        </w:rPr>
+        <w:t>filter</w:t>
+      </w:r>
+      <w:proofErr w:type="spellEnd"/>
+      <w:r>
+        <w:rPr>
+          <w:rFonts w:ascii="Inter" w:eastAsia="Times New Roman" w:hAnsi="Inter" w:cs="Times New Roman"/>
+          <w:color w:val="FFFFFF"/>
+          <w:kern w:val="0"/>
+          <w:sz w:val="21"/>
+          <w:szCs w:val="21"/>
+          <w:lang w:val="es-AR" w:eastAsia="es-AR"/>
+          <w14:ligatures w14:val="none"/>
+        </w:rPr>
+        <w:t xml:space="preserve"> de los </w:t>
+      </w:r>
+      <w:proofErr w:type="spellStart"/>
+      <w:r>
+        <w:rPr>
+          <w:rFonts w:ascii="Inter" w:eastAsia="Times New Roman" w:hAnsi="Inter" w:cs="Times New Roman"/>
+          <w:color w:val="FFFFFF"/>
+          <w:kern w:val="0"/>
+          <w:sz w:val="21"/>
+          <w:szCs w:val="21"/>
+          <w:lang w:val="es-AR" w:eastAsia="es-AR"/>
+          <w14:ligatures w14:val="none"/>
+        </w:rPr>
+        <w:t>Arrays</w:t>
+      </w:r>
+      <w:proofErr w:type="spellEnd"/>
+      <w:r>
+        <w:rPr>
+          <w:rFonts w:ascii="Inter" w:eastAsia="Times New Roman" w:hAnsi="Inter" w:cs="Times New Roman"/>
+          <w:color w:val="FFFFFF"/>
+          <w:kern w:val="0"/>
+          <w:sz w:val="21"/>
+          <w:szCs w:val="21"/>
+          <w:lang w:val="es-AR" w:eastAsia="es-AR"/>
+          <w14:ligatures w14:val="none"/>
+        </w:rPr>
+        <w:t>.</w:t>
+      </w:r>
+    </w:p>
+    <w:p>
+      <w:pPr>
+        <w:pStyle w:val="Prrafodelista"/>
+        <w:numPr>
+          <w:ilvl w:val="0"/>
+          <w:numId w:val="8"/>
+        </w:numPr>
+        <w:pBdr>
+          <w:top w:val="single" w:sz="2" w:space="0" w:color="auto"/>
+          <w:left w:val="single" w:sz="2" w:space="0" w:color="auto"/>
+          <w:bottom w:val="single" w:sz="2" w:space="0" w:color="auto"/>
+          <w:right w:val="single" w:sz="2" w:space="0" w:color="auto"/>
+        </w:pBdr>
+        <w:shd w:val="clear" w:color="auto" w:fill="1F2233"/>
+        <w:spacing w:after="240" w:line="300" w:lineRule="atLeast"/>
+        <w:rPr>
+          <w:rFonts w:ascii="Inter" w:eastAsia="Times New Roman" w:hAnsi="Inter" w:cs="Times New Roman"/>
+          <w:color w:val="FFFFFF"/>
+          <w:kern w:val="0"/>
+          <w:sz w:val="21"/>
+          <w:szCs w:val="21"/>
+          <w:lang w:val="es-AR" w:eastAsia="es-AR"/>
+          <w14:ligatures w14:val="none"/>
+        </w:rPr>
+      </w:pPr>
+      <w:r>
+        <w:rPr>
+          <w:rFonts w:ascii="Segoe UI Emoji" w:eastAsia="Times New Roman" w:hAnsi="Segoe UI Emoji" w:cs="Segoe UI Emoji"/>
+          <w:color w:val="FFFFFF"/>
+          <w:kern w:val="0"/>
+          <w:sz w:val="21"/>
+          <w:szCs w:val="21"/>
+          <w:lang w:val="es-AR" w:eastAsia="es-AR"/>
+          <w14:ligatures w14:val="none"/>
+        </w:rPr>
+        <w:t>💡</w:t>
+      </w:r>
+      <w:proofErr w:type="spellStart"/>
+      <w:r>
+        <w:rPr>
+          <w:rFonts w:ascii="Inter" w:eastAsia="Times New Roman" w:hAnsi="Inter" w:cs="Times New Roman"/>
+          <w:b/>
+          <w:bCs/>
+          <w:color w:val="FFFFFF"/>
+          <w:kern w:val="0"/>
+          <w:sz w:val="21"/>
+          <w:szCs w:val="21"/>
+          <w:bdr w:val="single" w:sz="2" w:space="0" w:color="auto" w:frame="1"/>
+          <w:lang w:val="es-AR" w:eastAsia="es-AR"/>
+          <w14:ligatures w14:val="none"/>
+        </w:rPr>
+        <w:t>Tips</w:t>
+      </w:r>
+      <w:proofErr w:type="spellEnd"/>
+    </w:p>
+    <w:p>
+      <w:pPr>
+        <w:pStyle w:val="Prrafodelista"/>
+        <w:numPr>
+          <w:ilvl w:val="0"/>
+          <w:numId w:val="8"/>
+        </w:numPr>
+        <w:pBdr>
+          <w:top w:val="single" w:sz="2" w:space="0" w:color="auto"/>
+          <w:left w:val="single" w:sz="2" w:space="0" w:color="auto"/>
+          <w:bottom w:val="single" w:sz="2" w:space="0" w:color="auto"/>
+          <w:right w:val="single" w:sz="2" w:space="0" w:color="auto"/>
+        </w:pBdr>
+        <w:shd w:val="clear" w:color="auto" w:fill="1F2233"/>
+        <w:spacing w:after="240" w:line="300" w:lineRule="atLeast"/>
+        <w:rPr>
+          <w:rFonts w:ascii="Inter" w:eastAsia="Times New Roman" w:hAnsi="Inter" w:cs="Times New Roman"/>
+          <w:color w:val="FFFFFF"/>
+          <w:kern w:val="0"/>
+          <w:sz w:val="21"/>
+          <w:szCs w:val="21"/>
+          <w:lang w:val="es-AR" w:eastAsia="es-AR"/>
+          <w14:ligatures w14:val="none"/>
+        </w:rPr>
+      </w:pPr>
+      <w:r>
+        <w:rPr>
+          <w:rFonts w:ascii="Inter" w:eastAsia="Times New Roman" w:hAnsi="Inter" w:cs="Times New Roman"/>
+          <w:color w:val="FFFFFF"/>
+          <w:kern w:val="0"/>
+          <w:sz w:val="21"/>
+          <w:szCs w:val="21"/>
+          <w:lang w:val="es-AR" w:eastAsia="es-AR"/>
+          <w14:ligatures w14:val="none"/>
+        </w:rPr>
+        <w:t xml:space="preserve">Entender el funcionamiento de estos métodos nos ayudará a comprender los principios de inmutabilidad de la programación funcional. Esto utiliza </w:t>
+      </w:r>
+      <w:proofErr w:type="spellStart"/>
+      <w:r>
+        <w:rPr>
+          <w:rFonts w:ascii="Inter" w:eastAsia="Times New Roman" w:hAnsi="Inter" w:cs="Times New Roman"/>
+          <w:color w:val="FFFFFF"/>
+          <w:kern w:val="0"/>
+          <w:sz w:val="21"/>
+          <w:szCs w:val="21"/>
+          <w:lang w:val="es-AR" w:eastAsia="es-AR"/>
+          <w14:ligatures w14:val="none"/>
+        </w:rPr>
+        <w:t>React</w:t>
+      </w:r>
+      <w:proofErr w:type="spellEnd"/>
+      <w:r>
+        <w:rPr>
+          <w:rFonts w:ascii="Inter" w:eastAsia="Times New Roman" w:hAnsi="Inter" w:cs="Times New Roman"/>
+          <w:color w:val="FFFFFF"/>
+          <w:kern w:val="0"/>
+          <w:sz w:val="21"/>
+          <w:szCs w:val="21"/>
+          <w:lang w:val="es-AR" w:eastAsia="es-AR"/>
+          <w14:ligatures w14:val="none"/>
+        </w:rPr>
+        <w:t xml:space="preserve"> para poder hacer la manipulación del DOM de forma </w:t>
+      </w:r>
+      <w:proofErr w:type="spellStart"/>
+      <w:r>
+        <w:rPr>
+          <w:rFonts w:ascii="Inter" w:eastAsia="Times New Roman" w:hAnsi="Inter" w:cs="Times New Roman"/>
+          <w:color w:val="FFFFFF"/>
+          <w:kern w:val="0"/>
+          <w:sz w:val="21"/>
+          <w:szCs w:val="21"/>
+          <w:lang w:val="es-AR" w:eastAsia="es-AR"/>
+          <w14:ligatures w14:val="none"/>
+        </w:rPr>
+        <w:t>performante</w:t>
+      </w:r>
+      <w:proofErr w:type="spellEnd"/>
+      <w:r>
+        <w:rPr>
+          <w:rFonts w:ascii="Inter" w:eastAsia="Times New Roman" w:hAnsi="Inter" w:cs="Times New Roman"/>
+          <w:color w:val="FFFFFF"/>
+          <w:kern w:val="0"/>
+          <w:sz w:val="21"/>
+          <w:szCs w:val="21"/>
+          <w:lang w:val="es-AR" w:eastAsia="es-AR"/>
+          <w14:ligatures w14:val="none"/>
+        </w:rPr>
+        <w:t>. No olvidar que necesitamos RETORNAR un array con los elementos que cumplen con la condición del filtro, por lo que dentro necesitaremos de un IF.</w:t>
+      </w:r>
+    </w:p>
+    <w:p>
+      <w:pPr>
+        <w:pStyle w:val="Prrafodelista"/>
+        <w:numPr>
+          <w:ilvl w:val="0"/>
+          <w:numId w:val="8"/>
+        </w:numPr>
+        <w:pBdr>
+          <w:top w:val="single" w:sz="2" w:space="12" w:color="auto"/>
+          <w:left w:val="single" w:sz="2" w:space="0" w:color="auto"/>
+          <w:bottom w:val="single" w:sz="2" w:space="0" w:color="auto"/>
+          <w:right w:val="single" w:sz="2" w:space="0" w:color="auto"/>
+        </w:pBdr>
+        <w:shd w:val="clear" w:color="auto" w:fill="1F2233"/>
+        <w:spacing w:after="240" w:line="240" w:lineRule="auto"/>
+        <w:outlineLvl w:val="1"/>
+        <w:rPr>
+          <w:rFonts w:ascii="Segoe UI" w:eastAsia="Times New Roman" w:hAnsi="Segoe UI" w:cs="Segoe UI"/>
+          <w:b/>
+          <w:bCs/>
+          <w:color w:val="FFFFFF"/>
+          <w:kern w:val="0"/>
+          <w:sz w:val="36"/>
+          <w:szCs w:val="36"/>
+          <w:lang w:val="es-AR" w:eastAsia="es-AR"/>
+          <w14:ligatures w14:val="none"/>
+        </w:rPr>
+      </w:pPr>
+      <w:r>
+        <w:rPr>
+          <w:rFonts w:ascii="Segoe UI" w:eastAsia="Times New Roman" w:hAnsi="Segoe UI" w:cs="Segoe UI"/>
+          <w:b/>
+          <w:bCs/>
+          <w:color w:val="FFFFFF"/>
+          <w:kern w:val="0"/>
+          <w:sz w:val="36"/>
+          <w:szCs w:val="36"/>
+          <w:lang w:val="es-AR" w:eastAsia="es-AR"/>
+          <w14:ligatures w14:val="none"/>
+        </w:rPr>
+        <w:t>Actividad 3: </w:t>
+      </w:r>
+      <w:r>
+        <w:rPr>
+          <w:rFonts w:ascii="Segoe UI" w:eastAsia="Times New Roman" w:hAnsi="Segoe UI" w:cs="Segoe UI"/>
+          <w:b/>
+          <w:bCs/>
+          <w:color w:val="FFFFFF"/>
+          <w:kern w:val="0"/>
+          <w:sz w:val="36"/>
+          <w:szCs w:val="36"/>
+          <w:bdr w:val="single" w:sz="2" w:space="0" w:color="auto" w:frame="1"/>
+          <w:lang w:val="es-AR" w:eastAsia="es-AR"/>
+          <w14:ligatures w14:val="none"/>
+        </w:rPr>
+        <w:t>Botón Multiuso II</w:t>
+      </w:r>
+    </w:p>
+    <w:p>
+      <w:pPr>
+        <w:pStyle w:val="Prrafodelista"/>
+        <w:numPr>
+          <w:ilvl w:val="0"/>
+          <w:numId w:val="8"/>
+        </w:numPr>
+        <w:pBdr>
+          <w:top w:val="single" w:sz="2" w:space="0" w:color="auto"/>
+          <w:left w:val="single" w:sz="2" w:space="0" w:color="auto"/>
+          <w:bottom w:val="single" w:sz="2" w:space="0" w:color="auto"/>
+          <w:right w:val="single" w:sz="2" w:space="0" w:color="auto"/>
+        </w:pBdr>
+        <w:shd w:val="clear" w:color="auto" w:fill="1F2233"/>
+        <w:spacing w:after="240" w:line="300" w:lineRule="atLeast"/>
+        <w:rPr>
+          <w:rFonts w:ascii="Inter" w:eastAsia="Times New Roman" w:hAnsi="Inter" w:cs="Times New Roman"/>
+          <w:color w:val="FFFFFF"/>
+          <w:kern w:val="0"/>
+          <w:sz w:val="21"/>
+          <w:szCs w:val="21"/>
+          <w:lang w:val="es-AR" w:eastAsia="es-AR"/>
+          <w14:ligatures w14:val="none"/>
+        </w:rPr>
+      </w:pPr>
+      <w:r>
+        <w:rPr>
+          <w:rFonts w:ascii="Inter" w:eastAsia="Times New Roman" w:hAnsi="Inter" w:cs="Times New Roman"/>
+          <w:color w:val="FFFFFF"/>
+          <w:kern w:val="0"/>
+          <w:sz w:val="21"/>
+          <w:szCs w:val="21"/>
+          <w:lang w:val="es-AR" w:eastAsia="es-AR"/>
+          <w14:ligatures w14:val="none"/>
+        </w:rPr>
+        <w:t xml:space="preserve">En un componente botón no es tan cómodo establecer su </w:t>
+      </w:r>
+      <w:proofErr w:type="spellStart"/>
+      <w:r>
+        <w:rPr>
+          <w:rFonts w:ascii="Inter" w:eastAsia="Times New Roman" w:hAnsi="Inter" w:cs="Times New Roman"/>
+          <w:color w:val="FFFFFF"/>
+          <w:kern w:val="0"/>
+          <w:sz w:val="21"/>
+          <w:szCs w:val="21"/>
+          <w:lang w:val="es-AR" w:eastAsia="es-AR"/>
+          <w14:ligatures w14:val="none"/>
+        </w:rPr>
+        <w:t>label</w:t>
+      </w:r>
+      <w:proofErr w:type="spellEnd"/>
+      <w:r>
+        <w:rPr>
+          <w:rFonts w:ascii="Inter" w:eastAsia="Times New Roman" w:hAnsi="Inter" w:cs="Times New Roman"/>
+          <w:color w:val="FFFFFF"/>
+          <w:kern w:val="0"/>
+          <w:sz w:val="21"/>
+          <w:szCs w:val="21"/>
+          <w:lang w:val="es-AR" w:eastAsia="es-AR"/>
+          <w14:ligatures w14:val="none"/>
+        </w:rPr>
+        <w:t xml:space="preserve"> como si fuese un atributo, sino que sería más fácil de entender si el texto lo escribo como hijo del componente. Aplicar la </w:t>
+      </w:r>
+      <w:proofErr w:type="spellStart"/>
+      <w:r>
+        <w:rPr>
+          <w:rFonts w:ascii="Inter" w:eastAsia="Times New Roman" w:hAnsi="Inter" w:cs="Times New Roman"/>
+          <w:color w:val="FFFFFF"/>
+          <w:kern w:val="0"/>
+          <w:sz w:val="21"/>
+          <w:szCs w:val="21"/>
+          <w:lang w:val="es-AR" w:eastAsia="es-AR"/>
+          <w14:ligatures w14:val="none"/>
+        </w:rPr>
+        <w:t>prop</w:t>
+      </w:r>
+      <w:proofErr w:type="spellEnd"/>
+      <w:r>
+        <w:rPr>
+          <w:rFonts w:ascii="Inter" w:eastAsia="Times New Roman" w:hAnsi="Inter" w:cs="Times New Roman"/>
+          <w:color w:val="FFFFFF"/>
+          <w:kern w:val="0"/>
+          <w:sz w:val="21"/>
+          <w:szCs w:val="21"/>
+          <w:lang w:val="es-AR" w:eastAsia="es-AR"/>
+          <w14:ligatures w14:val="none"/>
+        </w:rPr>
+        <w:t xml:space="preserve"> </w:t>
+      </w:r>
+      <w:proofErr w:type="spellStart"/>
+      <w:r>
+        <w:rPr>
+          <w:rFonts w:ascii="Inter" w:eastAsia="Times New Roman" w:hAnsi="Inter" w:cs="Times New Roman"/>
+          <w:color w:val="FFFFFF"/>
+          <w:kern w:val="0"/>
+          <w:sz w:val="21"/>
+          <w:szCs w:val="21"/>
+          <w:lang w:val="es-AR" w:eastAsia="es-AR"/>
+          <w14:ligatures w14:val="none"/>
+        </w:rPr>
+        <w:t>children</w:t>
+      </w:r>
+      <w:proofErr w:type="spellEnd"/>
+      <w:r>
+        <w:rPr>
+          <w:rFonts w:ascii="Inter" w:eastAsia="Times New Roman" w:hAnsi="Inter" w:cs="Times New Roman"/>
+          <w:color w:val="FFFFFF"/>
+          <w:kern w:val="0"/>
+          <w:sz w:val="21"/>
+          <w:szCs w:val="21"/>
+          <w:lang w:val="es-AR" w:eastAsia="es-AR"/>
+          <w14:ligatures w14:val="none"/>
+        </w:rPr>
+        <w:t xml:space="preserve"> para esto.</w:t>
+      </w:r>
+    </w:p>
+    <w:p>
+      <w:pPr>
+        <w:pStyle w:val="Prrafodelista"/>
+        <w:numPr>
+          <w:ilvl w:val="0"/>
+          <w:numId w:val="8"/>
+        </w:numPr>
+        <w:pBdr>
+          <w:top w:val="single" w:sz="2" w:space="0" w:color="auto"/>
+          <w:left w:val="single" w:sz="2" w:space="0" w:color="auto"/>
+          <w:bottom w:val="single" w:sz="2" w:space="0" w:color="auto"/>
+          <w:right w:val="single" w:sz="2" w:space="0" w:color="auto"/>
+        </w:pBdr>
+        <w:shd w:val="clear" w:color="auto" w:fill="1F2233"/>
+        <w:spacing w:after="240" w:line="300" w:lineRule="atLeast"/>
+        <w:rPr>
+          <w:rFonts w:ascii="Inter" w:eastAsia="Times New Roman" w:hAnsi="Inter" w:cs="Times New Roman"/>
+          <w:color w:val="FFFFFF"/>
+          <w:kern w:val="0"/>
+          <w:sz w:val="21"/>
+          <w:szCs w:val="21"/>
+          <w:lang w:val="es-AR" w:eastAsia="es-AR"/>
+          <w14:ligatures w14:val="none"/>
+        </w:rPr>
+      </w:pPr>
+      <w:r>
+        <w:rPr>
+          <w:rFonts w:ascii="Segoe UI Emoji" w:eastAsia="Times New Roman" w:hAnsi="Segoe UI Emoji" w:cs="Segoe UI Emoji"/>
+          <w:color w:val="FFFFFF"/>
+          <w:kern w:val="0"/>
+          <w:sz w:val="21"/>
+          <w:szCs w:val="21"/>
+          <w:lang w:val="es-AR" w:eastAsia="es-AR"/>
+          <w14:ligatures w14:val="none"/>
+        </w:rPr>
+        <w:t>💡</w:t>
+      </w:r>
+      <w:r>
+        <w:rPr>
+          <w:rFonts w:ascii="Inter" w:eastAsia="Times New Roman" w:hAnsi="Inter" w:cs="Times New Roman"/>
+          <w:color w:val="FFFFFF"/>
+          <w:kern w:val="0"/>
+          <w:sz w:val="21"/>
+          <w:szCs w:val="21"/>
+          <w:lang w:val="es-AR" w:eastAsia="es-AR"/>
+          <w14:ligatures w14:val="none"/>
+        </w:rPr>
+        <w:t> </w:t>
+      </w:r>
+      <w:proofErr w:type="spellStart"/>
+      <w:r>
+        <w:rPr>
+          <w:rFonts w:ascii="Inter" w:eastAsia="Times New Roman" w:hAnsi="Inter" w:cs="Times New Roman"/>
+          <w:b/>
+          <w:bCs/>
+          <w:color w:val="FFFFFF"/>
+          <w:kern w:val="0"/>
+          <w:sz w:val="21"/>
+          <w:szCs w:val="21"/>
+          <w:bdr w:val="single" w:sz="2" w:space="0" w:color="auto" w:frame="1"/>
+          <w:lang w:val="es-AR" w:eastAsia="es-AR"/>
+          <w14:ligatures w14:val="none"/>
+        </w:rPr>
+        <w:t>Tips</w:t>
+      </w:r>
+      <w:proofErr w:type="spellEnd"/>
+    </w:p>
+    <w:p>
+      <w:pPr>
+        <w:pStyle w:val="Prrafodelista"/>
+        <w:numPr>
+          <w:ilvl w:val="0"/>
+          <w:numId w:val="8"/>
+        </w:numPr>
+        <w:pBdr>
+          <w:top w:val="single" w:sz="2" w:space="0" w:color="auto"/>
+          <w:left w:val="single" w:sz="2" w:space="0" w:color="auto"/>
+          <w:bottom w:val="single" w:sz="2" w:space="0" w:color="auto"/>
+          <w:right w:val="single" w:sz="2" w:space="0" w:color="auto"/>
+        </w:pBdr>
+        <w:shd w:val="clear" w:color="auto" w:fill="1F2233"/>
+        <w:spacing w:after="240" w:line="300" w:lineRule="atLeast"/>
+        <w:rPr>
+          <w:rFonts w:ascii="Inter" w:eastAsia="Times New Roman" w:hAnsi="Inter" w:cs="Times New Roman"/>
+          <w:color w:val="FFFFFF"/>
+          <w:kern w:val="0"/>
+          <w:sz w:val="21"/>
+          <w:szCs w:val="21"/>
+          <w:lang w:val="es-AR" w:eastAsia="es-AR"/>
+          <w14:ligatures w14:val="none"/>
+        </w:rPr>
+      </w:pPr>
+      <w:r>
+        <w:rPr>
+          <w:rFonts w:ascii="Inter" w:eastAsia="Times New Roman" w:hAnsi="Inter" w:cs="Times New Roman"/>
+          <w:color w:val="FFFFFF"/>
+          <w:kern w:val="0"/>
+          <w:sz w:val="21"/>
+          <w:szCs w:val="21"/>
+          <w:lang w:val="es-AR" w:eastAsia="es-AR"/>
+          <w14:ligatures w14:val="none"/>
+        </w:rPr>
+        <w:t xml:space="preserve">En un componente botón no es tan cómodo establecer su </w:t>
+      </w:r>
+      <w:proofErr w:type="spellStart"/>
+      <w:r>
+        <w:rPr>
+          <w:rFonts w:ascii="Inter" w:eastAsia="Times New Roman" w:hAnsi="Inter" w:cs="Times New Roman"/>
+          <w:color w:val="FFFFFF"/>
+          <w:kern w:val="0"/>
+          <w:sz w:val="21"/>
+          <w:szCs w:val="21"/>
+          <w:lang w:val="es-AR" w:eastAsia="es-AR"/>
+          <w14:ligatures w14:val="none"/>
+        </w:rPr>
+        <w:t>label</w:t>
+      </w:r>
+      <w:proofErr w:type="spellEnd"/>
+      <w:r>
+        <w:rPr>
+          <w:rFonts w:ascii="Inter" w:eastAsia="Times New Roman" w:hAnsi="Inter" w:cs="Times New Roman"/>
+          <w:color w:val="FFFFFF"/>
+          <w:kern w:val="0"/>
+          <w:sz w:val="21"/>
+          <w:szCs w:val="21"/>
+          <w:lang w:val="es-AR" w:eastAsia="es-AR"/>
+          <w14:ligatures w14:val="none"/>
+        </w:rPr>
+        <w:t xml:space="preserve"> como si fuese un atributo, sino que sería más fácil de entender si el texto lo escribo como hijo del componente. Aplicar la </w:t>
+      </w:r>
+      <w:proofErr w:type="spellStart"/>
+      <w:r>
+        <w:rPr>
+          <w:rFonts w:ascii="Inter" w:eastAsia="Times New Roman" w:hAnsi="Inter" w:cs="Times New Roman"/>
+          <w:color w:val="FFFFFF"/>
+          <w:kern w:val="0"/>
+          <w:sz w:val="21"/>
+          <w:szCs w:val="21"/>
+          <w:lang w:val="es-AR" w:eastAsia="es-AR"/>
+          <w14:ligatures w14:val="none"/>
+        </w:rPr>
+        <w:t>prop</w:t>
+      </w:r>
+      <w:proofErr w:type="spellEnd"/>
+      <w:r>
+        <w:rPr>
+          <w:rFonts w:ascii="Inter" w:eastAsia="Times New Roman" w:hAnsi="Inter" w:cs="Times New Roman"/>
+          <w:color w:val="FFFFFF"/>
+          <w:kern w:val="0"/>
+          <w:sz w:val="21"/>
+          <w:szCs w:val="21"/>
+          <w:lang w:val="es-AR" w:eastAsia="es-AR"/>
+          <w14:ligatures w14:val="none"/>
+        </w:rPr>
+        <w:t xml:space="preserve"> </w:t>
+      </w:r>
+      <w:proofErr w:type="spellStart"/>
+      <w:r>
+        <w:rPr>
+          <w:rFonts w:ascii="Inter" w:eastAsia="Times New Roman" w:hAnsi="Inter" w:cs="Times New Roman"/>
+          <w:color w:val="FFFFFF"/>
+          <w:kern w:val="0"/>
+          <w:sz w:val="21"/>
+          <w:szCs w:val="21"/>
+          <w:lang w:val="es-AR" w:eastAsia="es-AR"/>
+          <w14:ligatures w14:val="none"/>
+        </w:rPr>
+        <w:t>children</w:t>
+      </w:r>
+      <w:proofErr w:type="spellEnd"/>
+      <w:r>
+        <w:rPr>
+          <w:rFonts w:ascii="Inter" w:eastAsia="Times New Roman" w:hAnsi="Inter" w:cs="Times New Roman"/>
+          <w:color w:val="FFFFFF"/>
+          <w:kern w:val="0"/>
+          <w:sz w:val="21"/>
+          <w:szCs w:val="21"/>
+          <w:lang w:val="es-AR" w:eastAsia="es-AR"/>
+          <w14:ligatures w14:val="none"/>
+        </w:rPr>
+        <w:t xml:space="preserve"> para esto.</w:t>
+      </w:r>
+    </w:p>
+    <w:p>
+      <w:r>
+        <w:rPr>
+          <w:noProof/>
+        </w:rPr>
+        <w:lastRenderedPageBreak/>
+        <w:drawing>
+          <wp:inline distT="0" distB="0" distL="0" distR="0" wp14:anchorId="56705939" wp14:editId="2809C4ED">
+            <wp:extent cx="5400040" cy="2185035"/>
+            <wp:effectExtent l="0" t="0" r="0" b="5715"/>
+            <wp:docPr id="316335861" name="Imagen 1" descr="Captura de pantalla de computadora&#10;&#10;El contenido generado por IA puede ser incorrecto."/>
+            <wp:cNvGraphicFramePr>
+              <a:graphicFrameLocks xmlns:a="http://schemas.openxmlformats.org/drawingml/2006/main" noChangeAspect="1"/>
+            </wp:cNvGraphicFramePr>
+            <a:graphic xmlns:a="http://schemas.openxmlformats.org/drawingml/2006/main">
+              <a:graphicData uri="http://schemas.openxmlformats.org/drawingml/2006/picture">
+                <pic:pic xmlns:pic="http://schemas.openxmlformats.org/drawingml/2006/picture">
+                  <pic:nvPicPr>
+                    <pic:cNvPr id="316335861" name="Imagen 1" descr="Captura de pantalla de computadora&#10;&#10;El contenido generado por IA puede ser incorrecto."/>
+                    <pic:cNvPicPr/>
+                  </pic:nvPicPr>
+                  <pic:blipFill>
+                    <a:blip r:embed="rId15"/>
+                    <a:stretch>
+                      <a:fillRect/>
+                    </a:stretch>
+                  </pic:blipFill>
+                  <pic:spPr>
+                    <a:xfrm>
+                      <a:off x="0" y="0"/>
+                      <a:ext cx="5400040" cy="2185035"/>
+                    </a:xfrm>
+                    <a:prstGeom prst="rect">
+                      <a:avLst/>
+                    </a:prstGeom>
+                  </pic:spPr>
+                </pic:pic>
+              </a:graphicData>
+            </a:graphic>
+          </wp:inline>
+        </w:drawing>
+      </w:r>
+    </w:p>
+    <w:p>
+      <w:r>
+        <w:rPr>
+          <w:noProof/>
+        </w:rPr>
+        <w:drawing>
+          <wp:inline distT="0" distB="0" distL="0" distR="0" wp14:anchorId="73D38664" wp14:editId="61499B03">
+            <wp:extent cx="5400040" cy="2078990"/>
+            <wp:effectExtent l="0" t="0" r="0" b="0"/>
+            <wp:docPr id="1541413331" name="Imagen 1" descr="Captura de pantalla de computadora&#10;&#10;El contenido generado por IA puede ser incorrecto."/>
+            <wp:cNvGraphicFramePr>
+              <a:graphicFrameLocks xmlns:a="http://schemas.openxmlformats.org/drawingml/2006/main" noChangeAspect="1"/>
+            </wp:cNvGraphicFramePr>
+            <a:graphic xmlns:a="http://schemas.openxmlformats.org/drawingml/2006/main">
+              <a:graphicData uri="http://schemas.openxmlformats.org/drawingml/2006/picture">
+                <pic:pic xmlns:pic="http://schemas.openxmlformats.org/drawingml/2006/picture">
+                  <pic:nvPicPr>
+                    <pic:cNvPr id="1541413331" name="Imagen 1" descr="Captura de pantalla de computadora&#10;&#10;El contenido generado por IA puede ser incorrecto."/>
+                    <pic:cNvPicPr/>
+                  </pic:nvPicPr>
+                  <pic:blipFill>
+                    <a:blip r:embed="rId16"/>
+                    <a:stretch>
+                      <a:fillRect/>
+                    </a:stretch>
+                  </pic:blipFill>
+                  <pic:spPr>
+                    <a:xfrm>
+                      <a:off x="0" y="0"/>
+                      <a:ext cx="5400040" cy="2078990"/>
+                    </a:xfrm>
+                    <a:prstGeom prst="rect">
+                      <a:avLst/>
+                    </a:prstGeom>
+                  </pic:spPr>
+                </pic:pic>
+              </a:graphicData>
+            </a:graphic>
+          </wp:inline>
+        </w:drawing>
       </w:r>
     </w:p>
     <w:p/>
@@ -4927,6 +7536,155 @@
     </w:lvl>
   </w:abstractNum>
   <w:abstractNum w:abstractNumId="4" w15:restartNumberingAfterBreak="0">
+    <w:nsid w:val="2AE66F5B"/>
+    <w:multiLevelType w:val="multilevel"/>
+    <w:tmpl w:val="71FE7FAA"/>
+    <w:lvl w:ilvl="0">
+      <w:start w:val="1"/>
+      <w:numFmt w:val="bullet"/>
+      <w:lvlText w:val=""/>
+      <w:lvlJc w:val="left"/>
+      <w:pPr>
+        <w:tabs>
+          <w:tab w:val="num" w:pos="720"/>
+        </w:tabs>
+        <w:ind w:left="720" w:hanging="360"/>
+      </w:pPr>
+      <w:rPr>
+        <w:rFonts w:ascii="Symbol" w:hAnsi="Symbol" w:hint="default"/>
+        <w:sz w:val="20"/>
+      </w:rPr>
+    </w:lvl>
+    <w:lvl w:ilvl="1" w:tentative="1">
+      <w:start w:val="1"/>
+      <w:numFmt w:val="bullet"/>
+      <w:lvlText w:val="o"/>
+      <w:lvlJc w:val="left"/>
+      <w:pPr>
+        <w:tabs>
+          <w:tab w:val="num" w:pos="1440"/>
+        </w:tabs>
+        <w:ind w:left="1440" w:hanging="360"/>
+      </w:pPr>
+      <w:rPr>
+        <w:rFonts w:ascii="Courier New" w:hAnsi="Courier New" w:hint="default"/>
+        <w:sz w:val="20"/>
+      </w:rPr>
+    </w:lvl>
+    <w:lvl w:ilvl="2" w:tentative="1">
+      <w:start w:val="1"/>
+      <w:numFmt w:val="bullet"/>
+      <w:lvlText w:val=""/>
+      <w:lvlJc w:val="left"/>
+      <w:pPr>
+        <w:tabs>
+          <w:tab w:val="num" w:pos="2160"/>
+        </w:tabs>
+        <w:ind w:left="2160" w:hanging="360"/>
+      </w:pPr>
+      <w:rPr>
+        <w:rFonts w:ascii="Wingdings" w:hAnsi="Wingdings" w:hint="default"/>
+        <w:sz w:val="20"/>
+      </w:rPr>
+    </w:lvl>
+    <w:lvl w:ilvl="3" w:tentative="1">
+      <w:start w:val="1"/>
+      <w:numFmt w:val="bullet"/>
+      <w:lvlText w:val=""/>
+      <w:lvlJc w:val="left"/>
+      <w:pPr>
+        <w:tabs>
+          <w:tab w:val="num" w:pos="2880"/>
+        </w:tabs>
+        <w:ind w:left="2880" w:hanging="360"/>
+      </w:pPr>
+      <w:rPr>
+        <w:rFonts w:ascii="Wingdings" w:hAnsi="Wingdings" w:hint="default"/>
+        <w:sz w:val="20"/>
+      </w:rPr>
+    </w:lvl>
+    <w:lvl w:ilvl="4" w:tentative="1">
+      <w:start w:val="1"/>
+      <w:numFmt w:val="bullet"/>
+      <w:lvlText w:val=""/>
+      <w:lvlJc w:val="left"/>
+      <w:pPr>
+        <w:tabs>
+          <w:tab w:val="num" w:pos="3600"/>
+        </w:tabs>
+        <w:ind w:left="3600" w:hanging="360"/>
+      </w:pPr>
+      <w:rPr>
+        <w:rFonts w:ascii="Wingdings" w:hAnsi="Wingdings" w:hint="default"/>
+        <w:sz w:val="20"/>
+      </w:rPr>
+    </w:lvl>
+    <w:lvl w:ilvl="5" w:tentative="1">
+      <w:start w:val="1"/>
+      <w:numFmt w:val="bullet"/>
+      <w:lvlText w:val=""/>
+      <w:lvlJc w:val="left"/>
+      <w:pPr>
+        <w:tabs>
+          <w:tab w:val="num" w:pos="4320"/>
+        </w:tabs>
+        <w:ind w:left="4320" w:hanging="360"/>
+      </w:pPr>
+      <w:rPr>
+        <w:rFonts w:ascii="Wingdings" w:hAnsi="Wingdings" w:hint="default"/>
+        <w:sz w:val="20"/>
+      </w:rPr>
+    </w:lvl>
+    <w:lvl w:ilvl="6" w:tentative="1">
+      <w:start w:val="1"/>
+      <w:numFmt w:val="bullet"/>
+      <w:lvlText w:val=""/>
+      <w:lvlJc w:val="left"/>
+      <w:pPr>
+        <w:tabs>
+          <w:tab w:val="num" w:pos="5040"/>
+        </w:tabs>
+        <w:ind w:left="5040" w:hanging="360"/>
+      </w:pPr>
+      <w:rPr>
+        <w:rFonts w:ascii="Wingdings" w:hAnsi="Wingdings" w:hint="default"/>
+        <w:sz w:val="20"/>
+      </w:rPr>
+    </w:lvl>
+    <w:lvl w:ilvl="7" w:tentative="1">
+      <w:start w:val="1"/>
+      <w:numFmt w:val="bullet"/>
+      <w:lvlText w:val=""/>
+      <w:lvlJc w:val="left"/>
+      <w:pPr>
+        <w:tabs>
+          <w:tab w:val="num" w:pos="5760"/>
+        </w:tabs>
+        <w:ind w:left="5760" w:hanging="360"/>
+      </w:pPr>
+      <w:rPr>
+        <w:rFonts w:ascii="Wingdings" w:hAnsi="Wingdings" w:hint="default"/>
+        <w:sz w:val="20"/>
+      </w:rPr>
+    </w:lvl>
+    <w:lvl w:ilvl="8" w:tentative="1">
+      <w:start w:val="1"/>
+      <w:numFmt w:val="bullet"/>
+      <w:lvlText w:val=""/>
+      <w:lvlJc w:val="left"/>
+      <w:pPr>
+        <w:tabs>
+          <w:tab w:val="num" w:pos="6480"/>
+        </w:tabs>
+        <w:ind w:left="6480" w:hanging="360"/>
+      </w:pPr>
+      <w:rPr>
+        <w:rFonts w:ascii="Wingdings" w:hAnsi="Wingdings" w:hint="default"/>
+        <w:sz w:val="20"/>
+      </w:rPr>
+    </w:lvl>
+  </w:abstractNum>
+  <w:abstractNum w:abstractNumId="5" w15:restartNumberingAfterBreak="0">
     <w:nsid w:val="399C5892"/>
     <w:multiLevelType w:val="multilevel"/>
     <w:tmpl w:val="4A24CC42"/>
@@ -5037,6 +7795,268 @@
         </w:tabs>
         <w:ind w:left="6480" w:hanging="360"/>
       </w:pPr>
+    </w:lvl>
+  </w:abstractNum>
+  <w:abstractNum w:abstractNumId="6" w15:restartNumberingAfterBreak="0">
+    <w:nsid w:val="699E3376"/>
+    <w:multiLevelType w:val="multilevel"/>
+    <w:tmpl w:val="C3EE1DBC"/>
+    <w:lvl w:ilvl="0">
+      <w:start w:val="1"/>
+      <w:numFmt w:val="decimal"/>
+      <w:lvlText w:val="%1."/>
+      <w:lvlJc w:val="left"/>
+      <w:pPr>
+        <w:tabs>
+          <w:tab w:val="num" w:pos="720"/>
+        </w:tabs>
+        <w:ind w:left="720" w:hanging="360"/>
+      </w:pPr>
+    </w:lvl>
+    <w:lvl w:ilvl="1" w:tentative="1">
+      <w:start w:val="1"/>
+      <w:numFmt w:val="decimal"/>
+      <w:lvlText w:val="%2."/>
+      <w:lvlJc w:val="left"/>
+      <w:pPr>
+        <w:tabs>
+          <w:tab w:val="num" w:pos="1440"/>
+        </w:tabs>
+        <w:ind w:left="1440" w:hanging="360"/>
+      </w:pPr>
+    </w:lvl>
+    <w:lvl w:ilvl="2" w:tentative="1">
+      <w:start w:val="1"/>
+      <w:numFmt w:val="decimal"/>
+      <w:lvlText w:val="%3."/>
+      <w:lvlJc w:val="left"/>
+      <w:pPr>
+        <w:tabs>
+          <w:tab w:val="num" w:pos="2160"/>
+        </w:tabs>
+        <w:ind w:left="2160" w:hanging="360"/>
+      </w:pPr>
+    </w:lvl>
+    <w:lvl w:ilvl="3" w:tentative="1">
+      <w:start w:val="1"/>
+      <w:numFmt w:val="decimal"/>
+      <w:lvlText w:val="%4."/>
+      <w:lvlJc w:val="left"/>
+      <w:pPr>
+        <w:tabs>
+          <w:tab w:val="num" w:pos="2880"/>
+        </w:tabs>
+        <w:ind w:left="2880" w:hanging="360"/>
+      </w:pPr>
+    </w:lvl>
+    <w:lvl w:ilvl="4" w:tentative="1">
+      <w:start w:val="1"/>
+      <w:numFmt w:val="decimal"/>
+      <w:lvlText w:val="%5."/>
+      <w:lvlJc w:val="left"/>
+      <w:pPr>
+        <w:tabs>
+          <w:tab w:val="num" w:pos="3600"/>
+        </w:tabs>
+        <w:ind w:left="3600" w:hanging="360"/>
+      </w:pPr>
+    </w:lvl>
+    <w:lvl w:ilvl="5" w:tentative="1">
+      <w:start w:val="1"/>
+      <w:numFmt w:val="decimal"/>
+      <w:lvlText w:val="%6."/>
+      <w:lvlJc w:val="left"/>
+      <w:pPr>
+        <w:tabs>
+          <w:tab w:val="num" w:pos="4320"/>
+        </w:tabs>
+        <w:ind w:left="4320" w:hanging="360"/>
+      </w:pPr>
+    </w:lvl>
+    <w:lvl w:ilvl="6" w:tentative="1">
+      <w:start w:val="1"/>
+      <w:numFmt w:val="decimal"/>
+      <w:lvlText w:val="%7."/>
+      <w:lvlJc w:val="left"/>
+      <w:pPr>
+        <w:tabs>
+          <w:tab w:val="num" w:pos="5040"/>
+        </w:tabs>
+        <w:ind w:left="5040" w:hanging="360"/>
+      </w:pPr>
+    </w:lvl>
+    <w:lvl w:ilvl="7" w:tentative="1">
+      <w:start w:val="1"/>
+      <w:numFmt w:val="decimal"/>
+      <w:lvlText w:val="%8."/>
+      <w:lvlJc w:val="left"/>
+      <w:pPr>
+        <w:tabs>
+          <w:tab w:val="num" w:pos="5760"/>
+        </w:tabs>
+        <w:ind w:left="5760" w:hanging="360"/>
+      </w:pPr>
+    </w:lvl>
+    <w:lvl w:ilvl="8" w:tentative="1">
+      <w:start w:val="1"/>
+      <w:numFmt w:val="decimal"/>
+      <w:lvlText w:val="%9."/>
+      <w:lvlJc w:val="left"/>
+      <w:pPr>
+        <w:tabs>
+          <w:tab w:val="num" w:pos="6480"/>
+        </w:tabs>
+        <w:ind w:left="6480" w:hanging="360"/>
+      </w:pPr>
+    </w:lvl>
+  </w:abstractNum>
+  <w:abstractNum w:abstractNumId="7" w15:restartNumberingAfterBreak="0">
+    <w:nsid w:val="7F2E5544"/>
+    <w:multiLevelType w:val="multilevel"/>
+    <w:tmpl w:val="9BA6E0A4"/>
+    <w:lvl w:ilvl="0">
+      <w:start w:val="1"/>
+      <w:numFmt w:val="bullet"/>
+      <w:lvlText w:val=""/>
+      <w:lvlJc w:val="left"/>
+      <w:pPr>
+        <w:tabs>
+          <w:tab w:val="num" w:pos="720"/>
+        </w:tabs>
+        <w:ind w:left="720" w:hanging="360"/>
+      </w:pPr>
+      <w:rPr>
+        <w:rFonts w:ascii="Symbol" w:hAnsi="Symbol" w:hint="default"/>
+        <w:sz w:val="20"/>
+      </w:rPr>
+    </w:lvl>
+    <w:lvl w:ilvl="1" w:tentative="1">
+      <w:start w:val="1"/>
+      <w:numFmt w:val="bullet"/>
+      <w:lvlText w:val="o"/>
+      <w:lvlJc w:val="left"/>
+      <w:pPr>
+        <w:tabs>
+          <w:tab w:val="num" w:pos="1440"/>
+        </w:tabs>
+        <w:ind w:left="1440" w:hanging="360"/>
+      </w:pPr>
+      <w:rPr>
+        <w:rFonts w:ascii="Courier New" w:hAnsi="Courier New" w:hint="default"/>
+        <w:sz w:val="20"/>
+      </w:rPr>
+    </w:lvl>
+    <w:lvl w:ilvl="2" w:tentative="1">
+      <w:start w:val="1"/>
+      <w:numFmt w:val="bullet"/>
+      <w:lvlText w:val=""/>
+      <w:lvlJc w:val="left"/>
+      <w:pPr>
+        <w:tabs>
+          <w:tab w:val="num" w:pos="2160"/>
+        </w:tabs>
+        <w:ind w:left="2160" w:hanging="360"/>
+      </w:pPr>
+      <w:rPr>
+        <w:rFonts w:ascii="Wingdings" w:hAnsi="Wingdings" w:hint="default"/>
+        <w:sz w:val="20"/>
+      </w:rPr>
+    </w:lvl>
+    <w:lvl w:ilvl="3" w:tentative="1">
+      <w:start w:val="1"/>
+      <w:numFmt w:val="bullet"/>
+      <w:lvlText w:val=""/>
+      <w:lvlJc w:val="left"/>
+      <w:pPr>
+        <w:tabs>
+          <w:tab w:val="num" w:pos="2880"/>
+        </w:tabs>
+        <w:ind w:left="2880" w:hanging="360"/>
+      </w:pPr>
+      <w:rPr>
+        <w:rFonts w:ascii="Wingdings" w:hAnsi="Wingdings" w:hint="default"/>
+        <w:sz w:val="20"/>
+      </w:rPr>
+    </w:lvl>
+    <w:lvl w:ilvl="4" w:tentative="1">
+      <w:start w:val="1"/>
+      <w:numFmt w:val="bullet"/>
+      <w:lvlText w:val=""/>
+      <w:lvlJc w:val="left"/>
+      <w:pPr>
+        <w:tabs>
+          <w:tab w:val="num" w:pos="3600"/>
+        </w:tabs>
+        <w:ind w:left="3600" w:hanging="360"/>
+      </w:pPr>
+      <w:rPr>
+        <w:rFonts w:ascii="Wingdings" w:hAnsi="Wingdings" w:hint="default"/>
+        <w:sz w:val="20"/>
+      </w:rPr>
+    </w:lvl>
+    <w:lvl w:ilvl="5" w:tentative="1">
+      <w:start w:val="1"/>
+      <w:numFmt w:val="bullet"/>
+      <w:lvlText w:val=""/>
+      <w:lvlJc w:val="left"/>
+      <w:pPr>
+        <w:tabs>
+          <w:tab w:val="num" w:pos="4320"/>
+        </w:tabs>
+        <w:ind w:left="4320" w:hanging="360"/>
+      </w:pPr>
+      <w:rPr>
+        <w:rFonts w:ascii="Wingdings" w:hAnsi="Wingdings" w:hint="default"/>
+        <w:sz w:val="20"/>
+      </w:rPr>
+    </w:lvl>
+    <w:lvl w:ilvl="6" w:tentative="1">
+      <w:start w:val="1"/>
+      <w:numFmt w:val="bullet"/>
+      <w:lvlText w:val=""/>
+      <w:lvlJc w:val="left"/>
+      <w:pPr>
+        <w:tabs>
+          <w:tab w:val="num" w:pos="5040"/>
+        </w:tabs>
+        <w:ind w:left="5040" w:hanging="360"/>
+      </w:pPr>
+      <w:rPr>
+        <w:rFonts w:ascii="Wingdings" w:hAnsi="Wingdings" w:hint="default"/>
+        <w:sz w:val="20"/>
+      </w:rPr>
+    </w:lvl>
+    <w:lvl w:ilvl="7" w:tentative="1">
+      <w:start w:val="1"/>
+      <w:numFmt w:val="bullet"/>
+      <w:lvlText w:val=""/>
+      <w:lvlJc w:val="left"/>
+      <w:pPr>
+        <w:tabs>
+          <w:tab w:val="num" w:pos="5760"/>
+        </w:tabs>
+        <w:ind w:left="5760" w:hanging="360"/>
+      </w:pPr>
+      <w:rPr>
+        <w:rFonts w:ascii="Wingdings" w:hAnsi="Wingdings" w:hint="default"/>
+        <w:sz w:val="20"/>
+      </w:rPr>
+    </w:lvl>
+    <w:lvl w:ilvl="8" w:tentative="1">
+      <w:start w:val="1"/>
+      <w:numFmt w:val="bullet"/>
+      <w:lvlText w:val=""/>
+      <w:lvlJc w:val="left"/>
+      <w:pPr>
+        <w:tabs>
+          <w:tab w:val="num" w:pos="6480"/>
+        </w:tabs>
+        <w:ind w:left="6480" w:hanging="360"/>
+      </w:pPr>
+      <w:rPr>
+        <w:rFonts w:ascii="Wingdings" w:hAnsi="Wingdings" w:hint="default"/>
+        <w:sz w:val="20"/>
+      </w:rPr>
     </w:lvl>
   </w:abstractNum>
   <w:num w:numId="1" w16cid:durableId="426115887">
@@ -5046,13 +8066,22 @@
     <w:abstractNumId w:val="2"/>
   </w:num>
   <w:num w:numId="3" w16cid:durableId="1549954121">
-    <w:abstractNumId w:val="4"/>
+    <w:abstractNumId w:val="5"/>
   </w:num>
   <w:num w:numId="4" w16cid:durableId="603342863">
     <w:abstractNumId w:val="1"/>
   </w:num>
   <w:num w:numId="5" w16cid:durableId="1286428715">
     <w:abstractNumId w:val="3"/>
+  </w:num>
+  <w:num w:numId="6" w16cid:durableId="1356299661">
+    <w:abstractNumId w:val="7"/>
+  </w:num>
+  <w:num w:numId="7" w16cid:durableId="2100641899">
+    <w:abstractNumId w:val="6"/>
+  </w:num>
+  <w:num w:numId="8" w16cid:durableId="251159803">
+    <w:abstractNumId w:val="4"/>
   </w:num>
 </w:numbering>
 </file>
@@ -5488,7 +8517,6 @@
     <w:next w:val="Normal"/>
     <w:link w:val="Ttulo2Car"/>
     <w:uiPriority w:val="9"/>
-    <w:semiHidden/>
     <w:unhideWhenUsed/>
     <w:qFormat/>
     <w:rsid w:val="00520E90"/>
@@ -5705,7 +8733,6 @@
     <w:basedOn w:val="Fuentedeprrafopredeter"/>
     <w:link w:val="Ttulo2"/>
     <w:uiPriority w:val="9"/>
-    <w:semiHidden/>
     <w:rsid w:val="00520E90"/>
     <w:rPr>
       <w:rFonts w:asciiTheme="majorHAnsi" w:eastAsiaTheme="majorEastAsia" w:hAnsiTheme="majorHAnsi" w:cstheme="majorBidi"/>
@@ -6012,6 +9039,45 @@
       <w:shd w:val="clear" w:color="auto" w:fill="E1DFDD"/>
     </w:rPr>
   </w:style>
+  <w:style w:type="character" w:styleId="Hipervnculovisitado">
+    <w:name w:val="FollowedHyperlink"/>
+    <w:basedOn w:val="Fuentedeprrafopredeter"/>
+    <w:uiPriority w:val="99"/>
+    <w:semiHidden/>
+    <w:unhideWhenUsed/>
+    <w:rsid w:val="00490F88"/>
+    <w:rPr>
+      <w:color w:val="954F72" w:themeColor="followedHyperlink"/>
+      <w:u w:val="single"/>
+    </w:rPr>
+  </w:style>
+  <w:style w:type="character" w:styleId="Textoennegrita">
+    <w:name w:val="Strong"/>
+    <w:basedOn w:val="Fuentedeprrafopredeter"/>
+    <w:uiPriority w:val="22"/>
+    <w:qFormat/>
+    <w:rsid w:val="00490F88"/>
+    <w:rPr>
+      <w:b/>
+      <w:bCs/>
+    </w:rPr>
+  </w:style>
+  <w:style w:type="paragraph" w:customStyle="1" w:styleId="bodys">
+    <w:name w:val="bodys"/>
+    <w:basedOn w:val="Normal"/>
+    <w:rsid w:val="00490F88"/>
+    <w:pPr>
+      <w:spacing w:before="100" w:beforeAutospacing="1" w:after="100" w:afterAutospacing="1" w:line="240" w:lineRule="auto"/>
+    </w:pPr>
+    <w:rPr>
+      <w:rFonts w:ascii="Times New Roman" w:eastAsia="Times New Roman" w:hAnsi="Times New Roman" w:cs="Times New Roman"/>
+      <w:kern w:val="0"/>
+      <w:sz w:val="24"/>
+      <w:szCs w:val="24"/>
+      <w:lang w:val="es-AR" w:eastAsia="es-AR"/>
+      <w14:ligatures w14:val="none"/>
+    </w:rPr>
+  </w:style>
 </w:styles>
 </file>
 

</xml_diff>